<commit_message>
updated the written report
</commit_message>
<xml_diff>
--- a/docs/NetGuard-AI-Written-Report.docx
+++ b/docs/NetGuard-AI-Written-Report.docx
@@ -226,7 +226,7 @@
           <w:szCs w:val="24"/>
           <w:rtl w:val="0"/>
         </w:rPr>
-        <w:t>Modern networks are exposed to threats such as port scanning, denial-of-service (DoS) attacks, and anomalous traffic patterns. Traditional signature-based intrusion detection systems (IDS) require frequent updates and struggle with unknown or behavioral attacks (Garcia-Teodoro et al., 2009). This report presents NetGuard AI, a lightweight IDS designed for educational and small-scale environments. The system combines a Random Forest classifier (Breiman, 2001) trained on NSL-KDD (Tavallaee et al., 2009) with rule-based detection for DoS and port-scan patterns. Traffic is ingested via a live packet sniffer built with Scapy (Biondi, n.d.) or a REST API, processed by a Node.js/Express backend (OpenJS Foundation, n.d.-a), scored by a FastAPI ML service (Ramírez, n.d.), stored in PostgreSQL (PostgreSQL Global Development Group, n.d.), and visualized in a multi-page React dashboard (Meta Platforms, Inc., n.d.). On the official NSL-KDD test set (KDDTest+, 22,544 flows), the model achieved 77.2% accuracy, 96.6% precision, 62.2% recall, and 75.7% F1-score for suspicious traffic. Lab testing with curl, hping3, and nmap demonstrated reproducible detection and alert generation. NetGuard AI meets the objectives defined in the group proposal (Cyber Experts, 2025) and provides a practical platform for teaching network security and machine learning.</w:t>
+        <w:t xml:space="preserve">Modern networks are exposed to threats such as port scanning, denial-of-service (DoS) attacks, and anomalous traffic patterns. Traditional signature-based intrusion detection systems (IDS) require frequent updates and struggle with unknown or behavioral attacks (Garcia-Teodoro et al., 2009). This report presents NetGuard AI, a lightweight IDS designed for educational and small-scale environments. The system combines a Random Forest classifier (Breiman, 2001) trained on NSL-KDD (Tavallaee et al., 2009) with rule-based detection for DoS and port-scan patterns. Traffic is ingested via a live packet sniffer built with Scapy (Biondi, n.d.) or a REST API, processed by a Node.js/Express backend (OpenJS Foundation, n.d.-a), scored by a FastAPI ML service (Ramírez, n.d.), stored in PostgreSQL (PostgreSQL Global Development Group, n.d.), and visualized in a multi-page React dashboard (Meta Platforms, Inc., n.d.). On the official NSL-KDD test set (KDDTest+, 22,544 flows), the model achieved 77.2% accuracy, 96.6% precision, 62.2% recall, and 75.7% F1-score for suspicious traffic. Lab testing with curl, hping3, and nmap demonstrated reproducible detection and alert generation. NetGuard AI meets the objectives defined in the group proposal (Cyber Experts, 2025) and provides a practical platform for teaching network security and machine learning.</w:t>
       </w:r>
       <w:r>
         <w:rPr>
@@ -326,7 +326,7 @@
         <w:widowControl w:val="1"/>
         <w:numPr>
           <w:ilvl w:val="0"/>
-          <w:numId w:val="2"/>
+          <w:numId w:val="3"/>
         </w:numPr>
         <w:pBdr>
           <w:top w:space="0" w:sz="0" w:val="nil"/>
@@ -374,7 +374,7 @@
         <w:widowControl w:val="1"/>
         <w:numPr>
           <w:ilvl w:val="0"/>
-          <w:numId w:val="2"/>
+          <w:numId w:val="3"/>
         </w:numPr>
         <w:pBdr>
           <w:top w:space="0" w:sz="0" w:val="nil"/>
@@ -422,7 +422,7 @@
         <w:widowControl w:val="1"/>
         <w:numPr>
           <w:ilvl w:val="0"/>
-          <w:numId w:val="2"/>
+          <w:numId w:val="3"/>
         </w:numPr>
         <w:pBdr>
           <w:top w:space="0" w:sz="0" w:val="nil"/>
@@ -470,7 +470,7 @@
         <w:widowControl w:val="1"/>
         <w:numPr>
           <w:ilvl w:val="0"/>
-          <w:numId w:val="2"/>
+          <w:numId w:val="3"/>
         </w:numPr>
         <w:pBdr>
           <w:top w:space="0" w:sz="0" w:val="nil"/>
@@ -518,7 +518,7 @@
         <w:widowControl w:val="1"/>
         <w:numPr>
           <w:ilvl w:val="0"/>
-          <w:numId w:val="2"/>
+          <w:numId w:val="3"/>
         </w:numPr>
         <w:pBdr>
           <w:top w:space="0" w:sz="0" w:val="nil"/>
@@ -1229,8 +1229,17 @@
         <w:tc>
           <w:tcPr/>
           <w:p>
-            <w:r>
-              <w:t>Random Forest on NSL-KDD-Train.csv; evaluated on official KDDTest+ (train_real_dataset.py)</w:t>
+            <w:pPr>
+              <w:rPr>
+                <w:rFonts w:ascii="Calibri" w:cs="Calibri" w:eastAsia="Calibri" w:hAnsi="Calibri"/>
+              </w:rPr>
+            </w:pPr>
+            <w:r>
+              <w:rPr>
+                <w:rFonts w:ascii="Calibri" w:cs="Calibri" w:eastAsia="Calibri" w:hAnsi="Calibri"/>
+                <w:rtl w:val="0"/>
+              </w:rPr>
+              <w:t xml:space="preserve">Random Forest on NSL-KDD-Train.csv; evaluated on official KDDTest+ (train_real_dataset.py)</w:t>
             </w:r>
           </w:p>
         </w:tc>
@@ -1562,7 +1571,7 @@
         <w:widowControl w:val="1"/>
         <w:numPr>
           <w:ilvl w:val="0"/>
-          <w:numId w:val="1"/>
+          <w:numId w:val="2"/>
         </w:numPr>
         <w:pBdr>
           <w:top w:space="0" w:sz="0" w:val="nil"/>
@@ -1610,7 +1619,7 @@
         <w:widowControl w:val="1"/>
         <w:numPr>
           <w:ilvl w:val="0"/>
-          <w:numId w:val="1"/>
+          <w:numId w:val="2"/>
         </w:numPr>
         <w:pBdr>
           <w:top w:space="0" w:sz="0" w:val="nil"/>
@@ -1658,7 +1667,7 @@
         <w:widowControl w:val="1"/>
         <w:numPr>
           <w:ilvl w:val="0"/>
-          <w:numId w:val="1"/>
+          <w:numId w:val="2"/>
         </w:numPr>
         <w:pBdr>
           <w:top w:space="0" w:sz="0" w:val="nil"/>
@@ -1706,7 +1715,7 @@
         <w:widowControl w:val="1"/>
         <w:numPr>
           <w:ilvl w:val="0"/>
-          <w:numId w:val="1"/>
+          <w:numId w:val="2"/>
         </w:numPr>
         <w:pBdr>
           <w:top w:space="0" w:sz="0" w:val="nil"/>
@@ -1754,7 +1763,7 @@
         <w:widowControl w:val="1"/>
         <w:numPr>
           <w:ilvl w:val="0"/>
-          <w:numId w:val="1"/>
+          <w:numId w:val="2"/>
         </w:numPr>
         <w:pBdr>
           <w:top w:space="0" w:sz="0" w:val="nil"/>
@@ -1838,7 +1847,7 @@
         <w:widowControl w:val="1"/>
         <w:numPr>
           <w:ilvl w:val="0"/>
-          <w:numId w:val="1"/>
+          <w:numId w:val="2"/>
         </w:numPr>
         <w:pBdr>
           <w:top w:space="0" w:sz="0" w:val="nil"/>
@@ -1886,7 +1895,7 @@
         <w:widowControl w:val="1"/>
         <w:numPr>
           <w:ilvl w:val="0"/>
-          <w:numId w:val="1"/>
+          <w:numId w:val="2"/>
         </w:numPr>
         <w:pBdr>
           <w:top w:space="0" w:sz="0" w:val="nil"/>
@@ -1934,7 +1943,7 @@
         <w:widowControl w:val="1"/>
         <w:numPr>
           <w:ilvl w:val="0"/>
-          <w:numId w:val="1"/>
+          <w:numId w:val="2"/>
         </w:numPr>
         <w:pBdr>
           <w:top w:space="0" w:sz="0" w:val="nil"/>
@@ -1982,7 +1991,7 @@
         <w:widowControl w:val="1"/>
         <w:numPr>
           <w:ilvl w:val="0"/>
-          <w:numId w:val="1"/>
+          <w:numId w:val="2"/>
         </w:numPr>
         <w:pBdr>
           <w:top w:space="0" w:sz="0" w:val="nil"/>
@@ -2030,7 +2039,7 @@
         <w:widowControl w:val="1"/>
         <w:numPr>
           <w:ilvl w:val="0"/>
-          <w:numId w:val="1"/>
+          <w:numId w:val="2"/>
         </w:numPr>
         <w:pBdr>
           <w:top w:space="0" w:sz="0" w:val="nil"/>
@@ -2078,7 +2087,7 @@
         <w:widowControl w:val="1"/>
         <w:numPr>
           <w:ilvl w:val="0"/>
-          <w:numId w:val="1"/>
+          <w:numId w:val="2"/>
         </w:numPr>
         <w:pBdr>
           <w:top w:space="0" w:sz="0" w:val="nil"/>
@@ -2162,7 +2171,7 @@
         <w:widowControl w:val="1"/>
         <w:numPr>
           <w:ilvl w:val="0"/>
-          <w:numId w:val="1"/>
+          <w:numId w:val="2"/>
         </w:numPr>
         <w:pBdr>
           <w:top w:space="0" w:sz="0" w:val="nil"/>
@@ -2210,7 +2219,7 @@
         <w:widowControl w:val="1"/>
         <w:numPr>
           <w:ilvl w:val="0"/>
-          <w:numId w:val="1"/>
+          <w:numId w:val="2"/>
         </w:numPr>
         <w:pBdr>
           <w:top w:space="0" w:sz="0" w:val="nil"/>
@@ -2258,7 +2267,7 @@
         <w:widowControl w:val="1"/>
         <w:numPr>
           <w:ilvl w:val="0"/>
-          <w:numId w:val="1"/>
+          <w:numId w:val="2"/>
         </w:numPr>
         <w:pBdr>
           <w:top w:space="0" w:sz="0" w:val="nil"/>
@@ -2386,7 +2395,7 @@
           <w:szCs w:val="24"/>
           <w:rtl w:val="0"/>
         </w:rPr>
-        <w:t>The NSL-KDD dataset (Tavallaee et al., 2009) was selected for training. It improves upon the original KDD Cup 99 benchmark (Lippmann et al., 2000) by removing redundant records and balancing difficulty. The production model was trained on NSL-KDD-Train.csv and evaluated on the official held-out test set NSL-KDD-Test.txt (KDDTest+), which train_real_dataset.py downloads automatically if missing. The team also reviewed CICIDS2017 (Sharafaldin et al., 2018) for future modernization but used NSL-KDD for consistency with the 41-feature schema.</w:t>
+        <w:t xml:space="preserve">The NSL-KDD dataset (Tavallaee et al., 2009) was selected for training. It improves upon the original KDD Cup 99 benchmark (Lippmann et al., 2000) by removing redundant records and balancing difficulty. The production model was trained on NSL-KDD-Train.csv and evaluated on the official held-out test set NSL-KDD-Test.txt (KDDTest+), which train_real_dataset.py downloads automatically if missing. The team also reviewed CICIDS2017 (Sharafaldin et al., 2018) for future modernization but used NSL-KDD for consistency with the 41-feature schema.</w:t>
       </w:r>
       <w:r>
         <w:rPr>
@@ -2458,7 +2467,7 @@
           <w:szCs w:val="24"/>
           <w:rtl w:val="0"/>
         </w:rPr>
-        <w:t>A Random Forest classifier with 100 estimators (Breiman, 2001) was implemented using scikit-learn (Pedregosa et al., 2011). The model performs binary classification: Normal vs Suspicious. After training on the full local training file, metrics were computed on the official KDDTest+ partition (never used for training). The trained model and encoders are serialized with joblib (Joblib developers, n.d.) as model.pkl and encoders.pkl.</w:t>
+        <w:t xml:space="preserve">A Random Forest classifier with 100 estimators (Breiman, 2001) was implemented using scikit-learn (Pedregosa et al., 2011). The model performs binary classification: Normal vs Suspicious. After training on the full local training file, metrics were computed on the official KDDTest+ partition (never used for training). The trained model and encoders are serialized with joblib (Joblib developers, n.d.) as model.pkl and encoders.pkl.</w:t>
       </w:r>
       <w:r>
         <w:rPr>
@@ -3276,6 +3285,20 @@
     </w:p>
     <w:p>
       <w:pPr>
+        <w:rPr>
+          <w:rFonts w:ascii="Calibri" w:cs="Calibri" w:eastAsia="Calibri" w:hAnsi="Calibri"/>
+        </w:rPr>
+      </w:pPr>
+      <w:r>
+        <w:rPr>
+          <w:rFonts w:ascii="Calibri" w:cs="Calibri" w:eastAsia="Calibri" w:hAnsi="Calibri"/>
+          <w:rtl w:val="0"/>
+        </w:rPr>
+        <w:t xml:space="preserve">Figure 1 (Appendix A) illustrates component connectivity. Figure 2 shows the detection decision flow from capture through rules, ML inference, logging, and alerts.</w:t>
+      </w:r>
+    </w:p>
+    <w:p>
+      <w:pPr>
         <w:spacing w:after="120" w:line="276" w:lineRule="auto"/>
         <w:rPr>
           <w:rFonts w:ascii="Calibri" w:cs="Calibri" w:eastAsia="Calibri" w:hAnsi="Calibri"/>
@@ -3298,6 +3321,342 @@
         <w:rPr>
           <w:rtl w:val="0"/>
         </w:rPr>
+      </w:r>
+    </w:p>
+    <w:p>
+      <w:pPr>
+        <w:keepNext w:val="0"/>
+        <w:keepLines w:val="0"/>
+        <w:pageBreakBefore w:val="0"/>
+        <w:widowControl w:val="1"/>
+        <w:numPr>
+          <w:ilvl w:val="0"/>
+          <w:numId w:val="3"/>
+        </w:numPr>
+        <w:pBdr>
+          <w:top w:space="0" w:sz="0" w:val="nil"/>
+          <w:left w:space="0" w:sz="0" w:val="nil"/>
+          <w:bottom w:space="0" w:sz="0" w:val="nil"/>
+          <w:right w:space="0" w:sz="0" w:val="nil"/>
+          <w:between w:space="0" w:sz="0" w:val="nil"/>
+        </w:pBdr>
+        <w:shd w:fill="auto" w:val="clear"/>
+        <w:spacing w:after="0" w:before="0" w:line="276" w:lineRule="auto"/>
+        <w:ind w:left="360" w:right="0" w:hanging="360"/>
+        <w:jc w:val="left"/>
+        <w:rPr>
+          <w:rFonts w:ascii="Calibri" w:cs="Calibri" w:eastAsia="Calibri" w:hAnsi="Calibri"/>
+        </w:rPr>
+      </w:pPr>
+      <w:r>
+        <w:rPr>
+          <w:rFonts w:ascii="Calibri" w:cs="Calibri" w:eastAsia="Calibri" w:hAnsi="Calibri"/>
+          <w:i w:val="0"/>
+          <w:iCs w:val="0"/>
+          <w:smallCaps w:val="0"/>
+          <w:strike w:val="0"/>
+          <w:color w:val="000000"/>
+          <w:sz w:val="24"/>
+          <w:szCs w:val="24"/>
+          <w:u w:val="none"/>
+          <w:shd w:fill="auto" w:val="clear"/>
+          <w:vertAlign w:val="baseline"/>
+          <w:rtl w:val="0"/>
+        </w:rPr>
+        <w:t xml:space="preserve">Traffic enters via live_sniffer.py or HTTP POST to /api/analyze.</w:t>
+      </w:r>
+      <w:r>
+        <w:rPr>
+          <w:rtl w:val="0"/>
+        </w:rPr>
+      </w:r>
+    </w:p>
+    <w:p>
+      <w:pPr>
+        <w:keepNext w:val="0"/>
+        <w:keepLines w:val="0"/>
+        <w:pageBreakBefore w:val="0"/>
+        <w:widowControl w:val="1"/>
+        <w:numPr>
+          <w:ilvl w:val="0"/>
+          <w:numId w:val="3"/>
+        </w:numPr>
+        <w:pBdr>
+          <w:top w:space="0" w:sz="0" w:val="nil"/>
+          <w:left w:space="0" w:sz="0" w:val="nil"/>
+          <w:bottom w:space="0" w:sz="0" w:val="nil"/>
+          <w:right w:space="0" w:sz="0" w:val="nil"/>
+          <w:between w:space="0" w:sz="0" w:val="nil"/>
+        </w:pBdr>
+        <w:shd w:fill="auto" w:val="clear"/>
+        <w:spacing w:after="0" w:before="0" w:line="276" w:lineRule="auto"/>
+        <w:ind w:left="360" w:right="0" w:hanging="360"/>
+        <w:jc w:val="left"/>
+        <w:rPr>
+          <w:rFonts w:ascii="Calibri" w:cs="Calibri" w:eastAsia="Calibri" w:hAnsi="Calibri"/>
+        </w:rPr>
+      </w:pPr>
+      <w:r>
+        <w:rPr>
+          <w:rFonts w:ascii="Calibri" w:cs="Calibri" w:eastAsia="Calibri" w:hAnsi="Calibri"/>
+          <w:i w:val="0"/>
+          <w:iCs w:val="0"/>
+          <w:smallCaps w:val="0"/>
+          <w:strike w:val="0"/>
+          <w:color w:val="000000"/>
+          <w:sz w:val="24"/>
+          <w:szCs w:val="24"/>
+          <w:u w:val="none"/>
+          <w:shd w:fill="auto" w:val="clear"/>
+          <w:vertAlign w:val="baseline"/>
+          <w:rtl w:val="0"/>
+        </w:rPr>
+        <w:t xml:space="preserve">The backend evaluates DoS and port scan rules first.</w:t>
+      </w:r>
+      <w:r>
+        <w:rPr>
+          <w:rtl w:val="0"/>
+        </w:rPr>
+      </w:r>
+    </w:p>
+    <w:p>
+      <w:pPr>
+        <w:keepNext w:val="0"/>
+        <w:keepLines w:val="0"/>
+        <w:pageBreakBefore w:val="0"/>
+        <w:widowControl w:val="1"/>
+        <w:numPr>
+          <w:ilvl w:val="0"/>
+          <w:numId w:val="3"/>
+        </w:numPr>
+        <w:pBdr>
+          <w:top w:space="0" w:sz="0" w:val="nil"/>
+          <w:left w:space="0" w:sz="0" w:val="nil"/>
+          <w:bottom w:space="0" w:sz="0" w:val="nil"/>
+          <w:right w:space="0" w:sz="0" w:val="nil"/>
+          <w:between w:space="0" w:sz="0" w:val="nil"/>
+        </w:pBdr>
+        <w:shd w:fill="auto" w:val="clear"/>
+        <w:spacing w:after="0" w:before="0" w:line="276" w:lineRule="auto"/>
+        <w:ind w:left="360" w:right="0" w:hanging="360"/>
+        <w:jc w:val="left"/>
+        <w:rPr>
+          <w:rFonts w:ascii="Calibri" w:cs="Calibri" w:eastAsia="Calibri" w:hAnsi="Calibri"/>
+        </w:rPr>
+      </w:pPr>
+      <w:r>
+        <w:rPr>
+          <w:rFonts w:ascii="Calibri" w:cs="Calibri" w:eastAsia="Calibri" w:hAnsi="Calibri"/>
+          <w:i w:val="0"/>
+          <w:iCs w:val="0"/>
+          <w:smallCaps w:val="0"/>
+          <w:strike w:val="0"/>
+          <w:color w:val="000000"/>
+          <w:sz w:val="24"/>
+          <w:szCs w:val="24"/>
+          <w:u w:val="none"/>
+          <w:shd w:fill="auto" w:val="clear"/>
+          <w:vertAlign w:val="baseline"/>
+          <w:rtl w:val="0"/>
+        </w:rPr>
+        <w:t xml:space="preserve">If no rule matches, features are sent to the ML service /predict endpoint (Ramírez, n.d.).</w:t>
+      </w:r>
+      <w:r>
+        <w:rPr>
+          <w:rtl w:val="0"/>
+        </w:rPr>
+      </w:r>
+    </w:p>
+    <w:p>
+      <w:pPr>
+        <w:keepNext w:val="0"/>
+        <w:keepLines w:val="0"/>
+        <w:pageBreakBefore w:val="0"/>
+        <w:widowControl w:val="1"/>
+        <w:numPr>
+          <w:ilvl w:val="0"/>
+          <w:numId w:val="3"/>
+        </w:numPr>
+        <w:pBdr>
+          <w:top w:space="0" w:sz="0" w:val="nil"/>
+          <w:left w:space="0" w:sz="0" w:val="nil"/>
+          <w:bottom w:space="0" w:sz="0" w:val="nil"/>
+          <w:right w:space="0" w:sz="0" w:val="nil"/>
+          <w:between w:space="0" w:sz="0" w:val="nil"/>
+        </w:pBdr>
+        <w:shd w:fill="auto" w:val="clear"/>
+        <w:spacing w:after="0" w:before="0" w:line="276" w:lineRule="auto"/>
+        <w:ind w:left="360" w:right="0" w:hanging="360"/>
+        <w:jc w:val="left"/>
+        <w:rPr>
+          <w:rFonts w:ascii="Calibri" w:cs="Calibri" w:eastAsia="Calibri" w:hAnsi="Calibri"/>
+        </w:rPr>
+      </w:pPr>
+      <w:r>
+        <w:rPr>
+          <w:rFonts w:ascii="Calibri" w:cs="Calibri" w:eastAsia="Calibri" w:hAnsi="Calibri"/>
+          <w:i w:val="0"/>
+          <w:iCs w:val="0"/>
+          <w:smallCaps w:val="0"/>
+          <w:strike w:val="0"/>
+          <w:color w:val="000000"/>
+          <w:sz w:val="24"/>
+          <w:szCs w:val="24"/>
+          <w:u w:val="none"/>
+          <w:shd w:fill="auto" w:val="clear"/>
+          <w:vertAlign w:val="baseline"/>
+          <w:rtl w:val="0"/>
+        </w:rPr>
+        <w:t xml:space="preserve">Results are written to traffic_logs.</w:t>
+      </w:r>
+      <w:r>
+        <w:rPr>
+          <w:rtl w:val="0"/>
+        </w:rPr>
+      </w:r>
+    </w:p>
+    <w:p>
+      <w:pPr>
+        <w:keepNext w:val="0"/>
+        <w:keepLines w:val="0"/>
+        <w:pageBreakBefore w:val="0"/>
+        <w:widowControl w:val="1"/>
+        <w:numPr>
+          <w:ilvl w:val="0"/>
+          <w:numId w:val="3"/>
+        </w:numPr>
+        <w:pBdr>
+          <w:top w:space="0" w:sz="0" w:val="nil"/>
+          <w:left w:space="0" w:sz="0" w:val="nil"/>
+          <w:bottom w:space="0" w:sz="0" w:val="nil"/>
+          <w:right w:space="0" w:sz="0" w:val="nil"/>
+          <w:between w:space="0" w:sz="0" w:val="nil"/>
+        </w:pBdr>
+        <w:shd w:fill="auto" w:val="clear"/>
+        <w:spacing w:after="0" w:before="0" w:line="276" w:lineRule="auto"/>
+        <w:ind w:left="360" w:right="0" w:hanging="360"/>
+        <w:jc w:val="left"/>
+        <w:rPr>
+          <w:rFonts w:ascii="Calibri" w:cs="Calibri" w:eastAsia="Calibri" w:hAnsi="Calibri"/>
+        </w:rPr>
+      </w:pPr>
+      <w:r>
+        <w:rPr>
+          <w:rFonts w:ascii="Calibri" w:cs="Calibri" w:eastAsia="Calibri" w:hAnsi="Calibri"/>
+          <w:i w:val="0"/>
+          <w:iCs w:val="0"/>
+          <w:smallCaps w:val="0"/>
+          <w:strike w:val="0"/>
+          <w:color w:val="000000"/>
+          <w:sz w:val="24"/>
+          <w:szCs w:val="24"/>
+          <w:u w:val="none"/>
+          <w:shd w:fill="auto" w:val="clear"/>
+          <w:vertAlign w:val="baseline"/>
+          <w:rtl w:val="0"/>
+        </w:rPr>
+        <w:t xml:space="preserve">If three consecutive suspicious windows target the same destination IP, an alert is created.</w:t>
+      </w:r>
+      <w:r>
+        <w:rPr>
+          <w:rtl w:val="0"/>
+        </w:rPr>
+      </w:r>
+    </w:p>
+    <w:p>
+      <w:pPr>
+        <w:keepNext w:val="0"/>
+        <w:keepLines w:val="0"/>
+        <w:pageBreakBefore w:val="0"/>
+        <w:widowControl w:val="1"/>
+        <w:numPr>
+          <w:ilvl w:val="0"/>
+          <w:numId w:val="3"/>
+        </w:numPr>
+        <w:pBdr>
+          <w:top w:space="0" w:sz="0" w:val="nil"/>
+          <w:left w:space="0" w:sz="0" w:val="nil"/>
+          <w:bottom w:space="0" w:sz="0" w:val="nil"/>
+          <w:right w:space="0" w:sz="0" w:val="nil"/>
+          <w:between w:space="0" w:sz="0" w:val="nil"/>
+        </w:pBdr>
+        <w:shd w:fill="auto" w:val="clear"/>
+        <w:spacing w:after="200" w:before="0" w:line="276" w:lineRule="auto"/>
+        <w:ind w:left="360" w:right="0" w:hanging="360"/>
+        <w:jc w:val="left"/>
+        <w:rPr>
+          <w:rFonts w:ascii="Calibri" w:cs="Calibri" w:eastAsia="Calibri" w:hAnsi="Calibri"/>
+        </w:rPr>
+      </w:pPr>
+      <w:r>
+        <w:rPr>
+          <w:rFonts w:ascii="Calibri" w:cs="Calibri" w:eastAsia="Calibri" w:hAnsi="Calibri"/>
+          <w:i w:val="0"/>
+          <w:iCs w:val="0"/>
+          <w:smallCaps w:val="0"/>
+          <w:strike w:val="0"/>
+          <w:color w:val="000000"/>
+          <w:sz w:val="24"/>
+          <w:szCs w:val="24"/>
+          <w:u w:val="none"/>
+          <w:shd w:fill="auto" w:val="clear"/>
+          <w:vertAlign w:val="baseline"/>
+          <w:rtl w:val="0"/>
+        </w:rPr>
+        <w:t xml:space="preserve">The React dashboard polls the backend every five seconds for logs and alerts.</w:t>
+      </w:r>
+      <w:r>
+        <w:rPr>
+          <w:rtl w:val="0"/>
+        </w:rPr>
+      </w:r>
+    </w:p>
+    <w:p>
+      <w:pPr>
+        <w:spacing w:after="120" w:line="276" w:lineRule="auto"/>
+        <w:rPr>
+          <w:rFonts w:ascii="Calibri" w:cs="Calibri" w:eastAsia="Calibri" w:hAnsi="Calibri"/>
+        </w:rPr>
+      </w:pPr>
+      <w:r>
+        <w:rPr>
+          <w:rFonts w:ascii="Calibri" w:cs="Calibri" w:eastAsia="Calibri" w:hAnsi="Calibri"/>
+          <w:i w:val="0"/>
+          <w:iCs w:val="0"/>
+          <w:sz w:val="24"/>
+          <w:szCs w:val="24"/>
+          <w:rtl w:val="0"/>
+        </w:rPr>
+        <w:t xml:space="preserve">This design separates concerns: Python handles ML and packet capture; Node.js handles business logic and persistence; React handles visualization.</w:t>
+      </w:r>
+      <w:r>
+        <w:rPr>
+          <w:rtl w:val="0"/>
+        </w:rPr>
+      </w:r>
+    </w:p>
+    <w:p>
+      <w:pPr>
+        <w:pStyle w:val="Heading1"/>
+        <w:rPr/>
+      </w:pPr>
+      <w:r>
+        <w:rPr>
+          <w:rtl w:val="0"/>
+        </w:rPr>
+        <w:t xml:space="preserve">7. Detection Methods</w:t>
+      </w:r>
+    </w:p>
+    <w:p>
+      <w:pPr>
+        <w:pStyle w:val="Heading2"/>
+        <w:rPr/>
+      </w:pPr>
+      <w:r>
+        <w:rPr>
+          <w:rtl w:val="0"/>
+        </w:rPr>
+        <w:t xml:space="preserve">7.1 Machine learning</w:t>
       </w:r>
     </w:p>
     <w:p>
@@ -3340,7 +3699,7 @@
           <w:vertAlign w:val="baseline"/>
           <w:rtl w:val="0"/>
         </w:rPr>
-        <w:t xml:space="preserve">Traffic enters via live_sniffer.py or HTTP POST to /api/analyze.</w:t>
+        <w:t xml:space="preserve">Algorithm: Random Forest, 100 trees (Breiman, 2001)</w:t>
       </w:r>
       <w:r>
         <w:rPr>
@@ -3388,7 +3747,7 @@
           <w:vertAlign w:val="baseline"/>
           <w:rtl w:val="0"/>
         </w:rPr>
-        <w:t xml:space="preserve">The backend evaluates DoS and port scan rules first.</w:t>
+        <w:t xml:space="preserve">Features: 41 NSL-KDD fields including duration, byte counts, error rates, and host statistics</w:t>
       </w:r>
       <w:r>
         <w:rPr>
@@ -3436,7 +3795,7 @@
           <w:vertAlign w:val="baseline"/>
           <w:rtl w:val="0"/>
         </w:rPr>
-        <w:t xml:space="preserve">If no rule matches, features are sent to the ML service /predict endpoint (Ramírez, n.d.).</w:t>
+        <w:t xml:space="preserve">Output: Normal or Suspicious with attack probability (0–1)</w:t>
       </w:r>
       <w:r>
         <w:rPr>
@@ -3484,55 +3843,7 @@
           <w:vertAlign w:val="baseline"/>
           <w:rtl w:val="0"/>
         </w:rPr>
-        <w:t xml:space="preserve">Results are written to traffic_logs.</w:t>
-      </w:r>
-      <w:r>
-        <w:rPr>
-          <w:rtl w:val="0"/>
-        </w:rPr>
-      </w:r>
-    </w:p>
-    <w:p>
-      <w:pPr>
-        <w:keepNext w:val="0"/>
-        <w:keepLines w:val="0"/>
-        <w:pageBreakBefore w:val="0"/>
-        <w:widowControl w:val="1"/>
-        <w:numPr>
-          <w:ilvl w:val="0"/>
-          <w:numId w:val="2"/>
-        </w:numPr>
-        <w:pBdr>
-          <w:top w:space="0" w:sz="0" w:val="nil"/>
-          <w:left w:space="0" w:sz="0" w:val="nil"/>
-          <w:bottom w:space="0" w:sz="0" w:val="nil"/>
-          <w:right w:space="0" w:sz="0" w:val="nil"/>
-          <w:between w:space="0" w:sz="0" w:val="nil"/>
-        </w:pBdr>
-        <w:shd w:fill="auto" w:val="clear"/>
-        <w:spacing w:after="0" w:before="0" w:line="276" w:lineRule="auto"/>
-        <w:ind w:left="360" w:right="0" w:hanging="360"/>
-        <w:jc w:val="left"/>
-        <w:rPr>
-          <w:rFonts w:ascii="Calibri" w:cs="Calibri" w:eastAsia="Calibri" w:hAnsi="Calibri"/>
-        </w:rPr>
-      </w:pPr>
-      <w:r>
-        <w:rPr>
-          <w:rFonts w:ascii="Calibri" w:cs="Calibri" w:eastAsia="Calibri" w:hAnsi="Calibri"/>
-          <w:i w:val="0"/>
-          <w:iCs w:val="0"/>
-          <w:smallCaps w:val="0"/>
-          <w:strike w:val="0"/>
-          <w:color w:val="000000"/>
-          <w:sz w:val="24"/>
-          <w:szCs w:val="24"/>
-          <w:u w:val="none"/>
-          <w:shd w:fill="auto" w:val="clear"/>
-          <w:vertAlign w:val="baseline"/>
-          <w:rtl w:val="0"/>
-        </w:rPr>
-        <w:t xml:space="preserve">If three consecutive suspicious windows target the same destination IP, an alert is created.</w:t>
+        <w:t xml:space="preserve">Threshold: ML_THRESHOLD = 0.4 — flows at or above 40% probability are Suspicious</w:t>
       </w:r>
       <w:r>
         <w:rPr>
@@ -3580,7 +3891,7 @@
           <w:vertAlign w:val="baseline"/>
           <w:rtl w:val="0"/>
         </w:rPr>
-        <w:t xml:space="preserve">The React dashboard polls the backend every five seconds for logs and alerts.</w:t>
+        <w:t xml:space="preserve">Attack label: attack_type = ml_anomaly when ML triggers suspicion</w:t>
       </w:r>
       <w:r>
         <w:rPr>
@@ -3604,295 +3915,7 @@
           <w:szCs w:val="24"/>
           <w:rtl w:val="0"/>
         </w:rPr>
-        <w:t xml:space="preserve">This design separates concerns: Python handles ML and packet capture; Node.js handles business logic and persistence; React handles visualization.</w:t>
-      </w:r>
-      <w:r>
-        <w:rPr>
-          <w:rtl w:val="0"/>
-        </w:rPr>
-      </w:r>
-    </w:p>
-    <w:p>
-      <w:pPr>
-        <w:pStyle w:val="Heading1"/>
-        <w:rPr/>
-      </w:pPr>
-      <w:r>
-        <w:rPr>
-          <w:rtl w:val="0"/>
-        </w:rPr>
-        <w:t xml:space="preserve">7. Detection Methods</w:t>
-      </w:r>
-    </w:p>
-    <w:p>
-      <w:pPr>
-        <w:pStyle w:val="Heading2"/>
-        <w:rPr/>
-      </w:pPr>
-      <w:r>
-        <w:rPr>
-          <w:rtl w:val="0"/>
-        </w:rPr>
-        <w:t xml:space="preserve">7.1 Machine learning</w:t>
-      </w:r>
-    </w:p>
-    <w:p>
-      <w:pPr>
-        <w:keepNext w:val="0"/>
-        <w:keepLines w:val="0"/>
-        <w:pageBreakBefore w:val="0"/>
-        <w:widowControl w:val="1"/>
-        <w:numPr>
-          <w:ilvl w:val="0"/>
-          <w:numId w:val="1"/>
-        </w:numPr>
-        <w:pBdr>
-          <w:top w:space="0" w:sz="0" w:val="nil"/>
-          <w:left w:space="0" w:sz="0" w:val="nil"/>
-          <w:bottom w:space="0" w:sz="0" w:val="nil"/>
-          <w:right w:space="0" w:sz="0" w:val="nil"/>
-          <w:between w:space="0" w:sz="0" w:val="nil"/>
-        </w:pBdr>
-        <w:shd w:fill="auto" w:val="clear"/>
-        <w:spacing w:after="0" w:before="0" w:line="276" w:lineRule="auto"/>
-        <w:ind w:left="360" w:right="0" w:hanging="360"/>
-        <w:jc w:val="left"/>
-        <w:rPr>
-          <w:rFonts w:ascii="Calibri" w:cs="Calibri" w:eastAsia="Calibri" w:hAnsi="Calibri"/>
-        </w:rPr>
-      </w:pPr>
-      <w:r>
-        <w:rPr>
-          <w:rFonts w:ascii="Calibri" w:cs="Calibri" w:eastAsia="Calibri" w:hAnsi="Calibri"/>
-          <w:i w:val="0"/>
-          <w:iCs w:val="0"/>
-          <w:smallCaps w:val="0"/>
-          <w:strike w:val="0"/>
-          <w:color w:val="000000"/>
-          <w:sz w:val="24"/>
-          <w:szCs w:val="24"/>
-          <w:u w:val="none"/>
-          <w:shd w:fill="auto" w:val="clear"/>
-          <w:vertAlign w:val="baseline"/>
-          <w:rtl w:val="0"/>
-        </w:rPr>
-        <w:t xml:space="preserve">Algorithm: Random Forest, 100 trees (Breiman, 2001)</w:t>
-      </w:r>
-      <w:r>
-        <w:rPr>
-          <w:rtl w:val="0"/>
-        </w:rPr>
-      </w:r>
-    </w:p>
-    <w:p>
-      <w:pPr>
-        <w:keepNext w:val="0"/>
-        <w:keepLines w:val="0"/>
-        <w:pageBreakBefore w:val="0"/>
-        <w:widowControl w:val="1"/>
-        <w:numPr>
-          <w:ilvl w:val="0"/>
-          <w:numId w:val="1"/>
-        </w:numPr>
-        <w:pBdr>
-          <w:top w:space="0" w:sz="0" w:val="nil"/>
-          <w:left w:space="0" w:sz="0" w:val="nil"/>
-          <w:bottom w:space="0" w:sz="0" w:val="nil"/>
-          <w:right w:space="0" w:sz="0" w:val="nil"/>
-          <w:between w:space="0" w:sz="0" w:val="nil"/>
-        </w:pBdr>
-        <w:shd w:fill="auto" w:val="clear"/>
-        <w:spacing w:after="0" w:before="0" w:line="276" w:lineRule="auto"/>
-        <w:ind w:left="360" w:right="0" w:hanging="360"/>
-        <w:jc w:val="left"/>
-        <w:rPr>
-          <w:rFonts w:ascii="Calibri" w:cs="Calibri" w:eastAsia="Calibri" w:hAnsi="Calibri"/>
-        </w:rPr>
-      </w:pPr>
-      <w:r>
-        <w:rPr>
-          <w:rFonts w:ascii="Calibri" w:cs="Calibri" w:eastAsia="Calibri" w:hAnsi="Calibri"/>
-          <w:i w:val="0"/>
-          <w:iCs w:val="0"/>
-          <w:smallCaps w:val="0"/>
-          <w:strike w:val="0"/>
-          <w:color w:val="000000"/>
-          <w:sz w:val="24"/>
-          <w:szCs w:val="24"/>
-          <w:u w:val="none"/>
-          <w:shd w:fill="auto" w:val="clear"/>
-          <w:vertAlign w:val="baseline"/>
-          <w:rtl w:val="0"/>
-        </w:rPr>
-        <w:t xml:space="preserve">Features: 41 NSL-KDD fields including duration, byte counts, error rates, and host statistics</w:t>
-      </w:r>
-      <w:r>
-        <w:rPr>
-          <w:rtl w:val="0"/>
-        </w:rPr>
-      </w:r>
-    </w:p>
-    <w:p>
-      <w:pPr>
-        <w:keepNext w:val="0"/>
-        <w:keepLines w:val="0"/>
-        <w:pageBreakBefore w:val="0"/>
-        <w:widowControl w:val="1"/>
-        <w:numPr>
-          <w:ilvl w:val="0"/>
-          <w:numId w:val="1"/>
-        </w:numPr>
-        <w:pBdr>
-          <w:top w:space="0" w:sz="0" w:val="nil"/>
-          <w:left w:space="0" w:sz="0" w:val="nil"/>
-          <w:bottom w:space="0" w:sz="0" w:val="nil"/>
-          <w:right w:space="0" w:sz="0" w:val="nil"/>
-          <w:between w:space="0" w:sz="0" w:val="nil"/>
-        </w:pBdr>
-        <w:shd w:fill="auto" w:val="clear"/>
-        <w:spacing w:after="0" w:before="0" w:line="276" w:lineRule="auto"/>
-        <w:ind w:left="360" w:right="0" w:hanging="360"/>
-        <w:jc w:val="left"/>
-        <w:rPr>
-          <w:rFonts w:ascii="Calibri" w:cs="Calibri" w:eastAsia="Calibri" w:hAnsi="Calibri"/>
-        </w:rPr>
-      </w:pPr>
-      <w:r>
-        <w:rPr>
-          <w:rFonts w:ascii="Calibri" w:cs="Calibri" w:eastAsia="Calibri" w:hAnsi="Calibri"/>
-          <w:i w:val="0"/>
-          <w:iCs w:val="0"/>
-          <w:smallCaps w:val="0"/>
-          <w:strike w:val="0"/>
-          <w:color w:val="000000"/>
-          <w:sz w:val="24"/>
-          <w:szCs w:val="24"/>
-          <w:u w:val="none"/>
-          <w:shd w:fill="auto" w:val="clear"/>
-          <w:vertAlign w:val="baseline"/>
-          <w:rtl w:val="0"/>
-        </w:rPr>
-        <w:t xml:space="preserve">Output: Normal or Suspicious with attack probability (0–1)</w:t>
-      </w:r>
-      <w:r>
-        <w:rPr>
-          <w:rtl w:val="0"/>
-        </w:rPr>
-      </w:r>
-    </w:p>
-    <w:p>
-      <w:pPr>
-        <w:keepNext w:val="0"/>
-        <w:keepLines w:val="0"/>
-        <w:pageBreakBefore w:val="0"/>
-        <w:widowControl w:val="1"/>
-        <w:numPr>
-          <w:ilvl w:val="0"/>
-          <w:numId w:val="1"/>
-        </w:numPr>
-        <w:pBdr>
-          <w:top w:space="0" w:sz="0" w:val="nil"/>
-          <w:left w:space="0" w:sz="0" w:val="nil"/>
-          <w:bottom w:space="0" w:sz="0" w:val="nil"/>
-          <w:right w:space="0" w:sz="0" w:val="nil"/>
-          <w:between w:space="0" w:sz="0" w:val="nil"/>
-        </w:pBdr>
-        <w:shd w:fill="auto" w:val="clear"/>
-        <w:spacing w:after="0" w:before="0" w:line="276" w:lineRule="auto"/>
-        <w:ind w:left="360" w:right="0" w:hanging="360"/>
-        <w:jc w:val="left"/>
-        <w:rPr>
-          <w:rFonts w:ascii="Calibri" w:cs="Calibri" w:eastAsia="Calibri" w:hAnsi="Calibri"/>
-        </w:rPr>
-      </w:pPr>
-      <w:r>
-        <w:rPr>
-          <w:rFonts w:ascii="Calibri" w:cs="Calibri" w:eastAsia="Calibri" w:hAnsi="Calibri"/>
-          <w:i w:val="0"/>
-          <w:iCs w:val="0"/>
-          <w:smallCaps w:val="0"/>
-          <w:strike w:val="0"/>
-          <w:color w:val="000000"/>
-          <w:sz w:val="24"/>
-          <w:szCs w:val="24"/>
-          <w:u w:val="none"/>
-          <w:shd w:fill="auto" w:val="clear"/>
-          <w:vertAlign w:val="baseline"/>
-          <w:rtl w:val="0"/>
-        </w:rPr>
-        <w:t xml:space="preserve">Threshold: ML_THRESHOLD = 0.4 — flows at or above 40% probability are Suspicious</w:t>
-      </w:r>
-      <w:r>
-        <w:rPr>
-          <w:rtl w:val="0"/>
-        </w:rPr>
-      </w:r>
-    </w:p>
-    <w:p>
-      <w:pPr>
-        <w:keepNext w:val="0"/>
-        <w:keepLines w:val="0"/>
-        <w:pageBreakBefore w:val="0"/>
-        <w:widowControl w:val="1"/>
-        <w:numPr>
-          <w:ilvl w:val="0"/>
-          <w:numId w:val="1"/>
-        </w:numPr>
-        <w:pBdr>
-          <w:top w:space="0" w:sz="0" w:val="nil"/>
-          <w:left w:space="0" w:sz="0" w:val="nil"/>
-          <w:bottom w:space="0" w:sz="0" w:val="nil"/>
-          <w:right w:space="0" w:sz="0" w:val="nil"/>
-          <w:between w:space="0" w:sz="0" w:val="nil"/>
-        </w:pBdr>
-        <w:shd w:fill="auto" w:val="clear"/>
-        <w:spacing w:after="200" w:before="0" w:line="276" w:lineRule="auto"/>
-        <w:ind w:left="360" w:right="0" w:hanging="360"/>
-        <w:jc w:val="left"/>
-        <w:rPr>
-          <w:rFonts w:ascii="Calibri" w:cs="Calibri" w:eastAsia="Calibri" w:hAnsi="Calibri"/>
-        </w:rPr>
-      </w:pPr>
-      <w:r>
-        <w:rPr>
-          <w:rFonts w:ascii="Calibri" w:cs="Calibri" w:eastAsia="Calibri" w:hAnsi="Calibri"/>
-          <w:i w:val="0"/>
-          <w:iCs w:val="0"/>
-          <w:smallCaps w:val="0"/>
-          <w:strike w:val="0"/>
-          <w:color w:val="000000"/>
-          <w:sz w:val="24"/>
-          <w:szCs w:val="24"/>
-          <w:u w:val="none"/>
-          <w:shd w:fill="auto" w:val="clear"/>
-          <w:vertAlign w:val="baseline"/>
-          <w:rtl w:val="0"/>
-        </w:rPr>
-        <w:t xml:space="preserve">Attack label: attack_type = ml_anomaly when ML triggers suspicion</w:t>
-      </w:r>
-      <w:r>
-        <w:rPr>
-          <w:rtl w:val="0"/>
-        </w:rPr>
-      </w:r>
-    </w:p>
-    <w:p>
-      <w:pPr>
-        <w:spacing w:after="120" w:line="276" w:lineRule="auto"/>
-        <w:rPr>
-          <w:rFonts w:ascii="Calibri" w:cs="Calibri" w:eastAsia="Calibri" w:hAnsi="Calibri"/>
-        </w:rPr>
-      </w:pPr>
-      <w:r>
-        <w:rPr>
-          <w:rFonts w:ascii="Calibri" w:cs="Calibri" w:eastAsia="Calibri" w:hAnsi="Calibri"/>
-          <w:i w:val="0"/>
-          <w:iCs w:val="0"/>
-          <w:sz w:val="24"/>
-          <w:szCs w:val="24"/>
-          <w:rtl w:val="0"/>
-        </w:rPr>
-        <w:t>The Random Forest was trained on NSL-KDD-Train.csv and evaluated on the official NSL-KDD test set (KDDTest+, NSL-KDD-Test.txt). Performance was measured with accuracy, precision, recall, F1-score, and a confusion matrix as specified in the proposal (Cyber Experts, 2025).</w:t>
+        <w:t xml:space="preserve">The Random Forest was trained on NSL-KDD-Train.csv and evaluated on the official NSL-KDD test set (KDDTest+, NSL-KDD-Test.txt). Performance was measured with accuracy, precision, recall, F1-score, and a confusion matrix as specified in the proposal (Cyber Experts, 2025).</w:t>
       </w:r>
       <w:r>
         <w:rPr>
@@ -5567,12 +5590,21 @@
         <w:rPr>
           <w:rtl w:val="0"/>
         </w:rPr>
-        <w:t>10.1 ML model metrics — official NSL-KDD test set (KDDTest+)</w:t>
-      </w:r>
-    </w:p>
-    <w:p>
-      <w:r>
-        <w:t>The model was trained on the full NSL-KDD-Train.csv file and evaluated on 22,544 held-out flows from the official KDDTest+ benchmark. Non-normal attack labels in the test set were mapped to Suspicious for binary IDS evaluation.</w:t>
+        <w:t xml:space="preserve">10.1 ML model metrics — official NSL-KDD test set (KDDTest+)</w:t>
+      </w:r>
+    </w:p>
+    <w:p>
+      <w:pPr>
+        <w:rPr>
+          <w:rFonts w:ascii="Calibri" w:cs="Calibri" w:eastAsia="Calibri" w:hAnsi="Calibri"/>
+        </w:rPr>
+      </w:pPr>
+      <w:r>
+        <w:rPr>
+          <w:rFonts w:ascii="Calibri" w:cs="Calibri" w:eastAsia="Calibri" w:hAnsi="Calibri"/>
+          <w:rtl w:val="0"/>
+        </w:rPr>
+        <w:t xml:space="preserve">The model was trained on the full NSL-KDD-Train.csv file and evaluated on 22,544 held-out flows from the official KDDTest+ benchmark. Non-normal attack labels in the test set were mapped to Suspicious for binary IDS evaluation.</w:t>
       </w:r>
     </w:p>
     <w:tbl>
@@ -5692,8 +5724,17 @@
         <w:tc>
           <w:tcPr/>
           <w:p>
-            <w:r>
-              <w:t>77.2%</w:t>
+            <w:pPr>
+              <w:rPr>
+                <w:rFonts w:ascii="Calibri" w:cs="Calibri" w:eastAsia="Calibri" w:hAnsi="Calibri"/>
+              </w:rPr>
+            </w:pPr>
+            <w:r>
+              <w:rPr>
+                <w:rFonts w:ascii="Calibri" w:cs="Calibri" w:eastAsia="Calibri" w:hAnsi="Calibri"/>
+                <w:rtl w:val="0"/>
+              </w:rPr>
+              <w:t xml:space="preserve">77.2%</w:t>
             </w:r>
           </w:p>
         </w:tc>
@@ -5730,8 +5771,17 @@
         <w:tc>
           <w:tcPr/>
           <w:p>
-            <w:r>
-              <w:t>96.6%</w:t>
+            <w:pPr>
+              <w:rPr>
+                <w:rFonts w:ascii="Calibri" w:cs="Calibri" w:eastAsia="Calibri" w:hAnsi="Calibri"/>
+              </w:rPr>
+            </w:pPr>
+            <w:r>
+              <w:rPr>
+                <w:rFonts w:ascii="Calibri" w:cs="Calibri" w:eastAsia="Calibri" w:hAnsi="Calibri"/>
+                <w:rtl w:val="0"/>
+              </w:rPr>
+              <w:t xml:space="preserve">96.6%</w:t>
             </w:r>
           </w:p>
         </w:tc>
@@ -5768,8 +5818,17 @@
         <w:tc>
           <w:tcPr/>
           <w:p>
-            <w:r>
-              <w:t>62.2%</w:t>
+            <w:pPr>
+              <w:rPr>
+                <w:rFonts w:ascii="Calibri" w:cs="Calibri" w:eastAsia="Calibri" w:hAnsi="Calibri"/>
+              </w:rPr>
+            </w:pPr>
+            <w:r>
+              <w:rPr>
+                <w:rFonts w:ascii="Calibri" w:cs="Calibri" w:eastAsia="Calibri" w:hAnsi="Calibri"/>
+                <w:rtl w:val="0"/>
+              </w:rPr>
+              <w:t xml:space="preserve">62.2%</w:t>
             </w:r>
           </w:p>
         </w:tc>
@@ -5806,8 +5865,17 @@
         <w:tc>
           <w:tcPr/>
           <w:p>
-            <w:r>
-              <w:t>75.7%</w:t>
+            <w:pPr>
+              <w:rPr>
+                <w:rFonts w:ascii="Calibri" w:cs="Calibri" w:eastAsia="Calibri" w:hAnsi="Calibri"/>
+              </w:rPr>
+            </w:pPr>
+            <w:r>
+              <w:rPr>
+                <w:rFonts w:ascii="Calibri" w:cs="Calibri" w:eastAsia="Calibri" w:hAnsi="Calibri"/>
+                <w:rtl w:val="0"/>
+              </w:rPr>
+              <w:t xml:space="preserve">75.7%</w:t>
             </w:r>
           </w:p>
         </w:tc>
@@ -5841,17 +5909,26 @@
           <w:szCs w:val="24"/>
           <w:rtl w:val="0"/>
         </w:rPr>
-        <w:t>The confusion matrix on the official test set was: true normal 9,431; false positive 280; false negative 4,855; true suspicious 7,978. High precision (96.6%) means most Suspicious predictions are correct, supporting trustworthy alerts. Moderate recall (62.2%) indicates some attack flows are missed — an expected trade-off on the challenging KDDTest+ benchmark and a direction for future work. These results demonstrate that the Random Forest approach (Breiman, 2001) learns meaningful flow-level patterns on standard IDS benchmark data.</w:t>
-      </w:r>
-      <w:r>
-        <w:rPr>
-          <w:rtl w:val="0"/>
-        </w:rPr>
-      </w:r>
-    </w:p>
-    <w:p>
-      <w:r>
-        <w:t>A supplementary 20% stratified holdout from the same training file scored approximately 99.9% accuracy. That figure is optimistic because train and test rows share the same file and simplified normal/anomaly labels; it is reported only as a sanity check, not as the primary benchmark.</w:t>
+        <w:t xml:space="preserve">The confusion matrix on the official test set was: true normal 9,431; false positive 280; false negative 4,855; true suspicious 7,978. High precision (96.6%) means most Suspicious predictions are correct, supporting trustworthy alerts. Moderate recall (62.2%) indicates some attack flows are missed — an expected trade-off on the challenging KDDTest+ benchmark and a direction for future work. These results demonstrate that the Random Forest approach (Breiman, 2001) learns meaningful flow-level patterns on standard IDS benchmark data.</w:t>
+      </w:r>
+      <w:r>
+        <w:rPr>
+          <w:rtl w:val="0"/>
+        </w:rPr>
+      </w:r>
+    </w:p>
+    <w:p>
+      <w:pPr>
+        <w:rPr>
+          <w:rFonts w:ascii="Calibri" w:cs="Calibri" w:eastAsia="Calibri" w:hAnsi="Calibri"/>
+        </w:rPr>
+      </w:pPr>
+      <w:r>
+        <w:rPr>
+          <w:rFonts w:ascii="Calibri" w:cs="Calibri" w:eastAsia="Calibri" w:hAnsi="Calibri"/>
+          <w:rtl w:val="0"/>
+        </w:rPr>
+        <w:t xml:space="preserve">A supplementary 20% stratified holdout from the same training file scored approximately 99.9% accuracy. That figure is optimistic because train and test rows share the same file and simplified normal/anomaly labels; it is reported only as a sanity check, not as the primary benchmark.</w:t>
       </w:r>
     </w:p>
     <w:p>
@@ -5874,7 +5951,7 @@
         <w:widowControl w:val="1"/>
         <w:numPr>
           <w:ilvl w:val="0"/>
-          <w:numId w:val="1"/>
+          <w:numId w:val="2"/>
         </w:numPr>
         <w:pBdr>
           <w:top w:space="0" w:sz="0" w:val="nil"/>
@@ -5922,7 +5999,7 @@
         <w:widowControl w:val="1"/>
         <w:numPr>
           <w:ilvl w:val="0"/>
-          <w:numId w:val="1"/>
+          <w:numId w:val="2"/>
         </w:numPr>
         <w:pBdr>
           <w:top w:space="0" w:sz="0" w:val="nil"/>
@@ -5970,7 +6047,7 @@
         <w:widowControl w:val="1"/>
         <w:numPr>
           <w:ilvl w:val="0"/>
-          <w:numId w:val="1"/>
+          <w:numId w:val="2"/>
         </w:numPr>
         <w:pBdr>
           <w:top w:space="0" w:sz="0" w:val="nil"/>
@@ -7031,8 +7108,17 @@
         <w:tc>
           <w:tcPr/>
           <w:p>
-            <w:r>
-              <w:t>Achieved (77.2% accuracy, 75.7% F1 on official KDDTest+ test set)</w:t>
+            <w:pPr>
+              <w:rPr>
+                <w:rFonts w:ascii="Calibri" w:cs="Calibri" w:eastAsia="Calibri" w:hAnsi="Calibri"/>
+              </w:rPr>
+            </w:pPr>
+            <w:r>
+              <w:rPr>
+                <w:rFonts w:ascii="Calibri" w:cs="Calibri" w:eastAsia="Calibri" w:hAnsi="Calibri"/>
+                <w:rtl w:val="0"/>
+              </w:rPr>
+              <w:t xml:space="preserve">Achieved (77.2% accuracy, 75.7% F1 on official KDDTest+ test set)</w:t>
             </w:r>
           </w:p>
         </w:tc>
@@ -7303,10 +7389,20 @@
         </w:pBdr>
         <w:shd w:fill="auto" w:val="clear"/>
         <w:spacing w:after="0" w:before="0" w:line="276" w:lineRule="auto"/>
-        <w:ind w:left="360" w:right="0" w:hanging="360"/>
+        <w:ind w:left="720" w:right="0" w:hanging="360"/>
         <w:jc w:val="left"/>
         <w:rPr>
           <w:rFonts w:ascii="Calibri" w:cs="Calibri" w:eastAsia="Calibri" w:hAnsi="Calibri"/>
+          <w:i w:val="0"/>
+          <w:iCs w:val="0"/>
+          <w:smallCaps w:val="0"/>
+          <w:strike w:val="0"/>
+          <w:color w:val="000000"/>
+          <w:sz w:val="24"/>
+          <w:szCs w:val="24"/>
+          <w:u w:val="none"/>
+          <w:shd w:fill="auto" w:val="clear"/>
+          <w:vertAlign w:val="baseline"/>
         </w:rPr>
       </w:pPr>
       <w:r>
@@ -7351,10 +7447,20 @@
         </w:pBdr>
         <w:shd w:fill="auto" w:val="clear"/>
         <w:spacing w:after="0" w:before="0" w:line="276" w:lineRule="auto"/>
-        <w:ind w:left="360" w:right="0" w:hanging="360"/>
+        <w:ind w:left="720" w:right="0" w:hanging="360"/>
         <w:jc w:val="left"/>
         <w:rPr>
           <w:rFonts w:ascii="Calibri" w:cs="Calibri" w:eastAsia="Calibri" w:hAnsi="Calibri"/>
+          <w:i w:val="0"/>
+          <w:iCs w:val="0"/>
+          <w:smallCaps w:val="0"/>
+          <w:strike w:val="0"/>
+          <w:color w:val="000000"/>
+          <w:sz w:val="24"/>
+          <w:szCs w:val="24"/>
+          <w:u w:val="none"/>
+          <w:shd w:fill="auto" w:val="clear"/>
+          <w:vertAlign w:val="baseline"/>
         </w:rPr>
       </w:pPr>
       <w:r>
@@ -7399,10 +7505,20 @@
         </w:pBdr>
         <w:shd w:fill="auto" w:val="clear"/>
         <w:spacing w:after="0" w:before="0" w:line="276" w:lineRule="auto"/>
-        <w:ind w:left="360" w:right="0" w:hanging="360"/>
+        <w:ind w:left="720" w:right="0" w:hanging="360"/>
         <w:jc w:val="left"/>
         <w:rPr>
           <w:rFonts w:ascii="Calibri" w:cs="Calibri" w:eastAsia="Calibri" w:hAnsi="Calibri"/>
+          <w:i w:val="0"/>
+          <w:iCs w:val="0"/>
+          <w:smallCaps w:val="0"/>
+          <w:strike w:val="0"/>
+          <w:color w:val="000000"/>
+          <w:sz w:val="24"/>
+          <w:szCs w:val="24"/>
+          <w:u w:val="none"/>
+          <w:shd w:fill="auto" w:val="clear"/>
+          <w:vertAlign w:val="baseline"/>
         </w:rPr>
       </w:pPr>
       <w:r>
@@ -7447,10 +7563,20 @@
         </w:pBdr>
         <w:shd w:fill="auto" w:val="clear"/>
         <w:spacing w:after="0" w:before="0" w:line="276" w:lineRule="auto"/>
-        <w:ind w:left="360" w:right="0" w:hanging="360"/>
+        <w:ind w:left="720" w:right="0" w:hanging="360"/>
         <w:jc w:val="left"/>
         <w:rPr>
           <w:rFonts w:ascii="Calibri" w:cs="Calibri" w:eastAsia="Calibri" w:hAnsi="Calibri"/>
+          <w:i w:val="0"/>
+          <w:iCs w:val="0"/>
+          <w:smallCaps w:val="0"/>
+          <w:strike w:val="0"/>
+          <w:color w:val="000000"/>
+          <w:sz w:val="24"/>
+          <w:szCs w:val="24"/>
+          <w:u w:val="none"/>
+          <w:shd w:fill="auto" w:val="clear"/>
+          <w:vertAlign w:val="baseline"/>
         </w:rPr>
       </w:pPr>
       <w:r>
@@ -7495,13 +7621,8 @@
         </w:pBdr>
         <w:shd w:fill="auto" w:val="clear"/>
         <w:spacing w:after="200" w:before="0" w:line="276" w:lineRule="auto"/>
-        <w:ind w:left="360" w:right="0" w:hanging="360"/>
+        <w:ind w:left="720" w:right="0" w:hanging="360"/>
         <w:jc w:val="left"/>
-        <w:rPr>
-          <w:rFonts w:ascii="Calibri" w:cs="Calibri" w:eastAsia="Calibri" w:hAnsi="Calibri"/>
-        </w:rPr>
-      </w:pPr>
-      <w:r>
         <w:rPr>
           <w:rFonts w:ascii="Calibri" w:cs="Calibri" w:eastAsia="Calibri" w:hAnsi="Calibri"/>
           <w:i w:val="0"/>
@@ -7514,6 +7635,21 @@
           <w:u w:val="none"/>
           <w:shd w:fill="auto" w:val="clear"/>
           <w:vertAlign w:val="baseline"/>
+        </w:rPr>
+      </w:pPr>
+      <w:r>
+        <w:rPr>
+          <w:rFonts w:ascii="Calibri" w:cs="Calibri" w:eastAsia="Calibri" w:hAnsi="Calibri"/>
+          <w:i w:val="0"/>
+          <w:iCs w:val="0"/>
+          <w:smallCaps w:val="0"/>
+          <w:strike w:val="0"/>
+          <w:color w:val="000000"/>
+          <w:sz w:val="24"/>
+          <w:szCs w:val="24"/>
+          <w:u w:val="none"/>
+          <w:shd w:fill="auto" w:val="clear"/>
+          <w:vertAlign w:val="baseline"/>
           <w:rtl w:val="0"/>
         </w:rPr>
         <w:t xml:space="preserve">CSV export and role-based dashboard authentication</w:t>
@@ -7528,11 +7664,2782 @@
       <w:pPr>
         <w:rPr>
           <w:rFonts w:ascii="Calibri" w:cs="Calibri" w:eastAsia="Calibri" w:hAnsi="Calibri"/>
-        </w:rPr>
-      </w:pPr>
-      <w:r>
-        <w:br w:type="page"/>
-      </w:r>
+          <w:b w:val="1"/>
+          <w:bCs w:val="1"/>
+          <w:color w:val="4f81bd"/>
+          <w:sz w:val="26"/>
+          <w:szCs w:val="26"/>
+        </w:rPr>
+      </w:pPr>
+      <w:r>
+        <w:rPr>
+          <w:rFonts w:ascii="Calibri" w:cs="Calibri" w:eastAsia="Calibri" w:hAnsi="Calibri"/>
+          <w:b w:val="1"/>
+          <w:bCs w:val="1"/>
+          <w:color w:val="4f81bd"/>
+          <w:sz w:val="26"/>
+          <w:szCs w:val="26"/>
+          <w:rtl w:val="0"/>
+        </w:rPr>
+        <w:t xml:space="preserve">12.4 Lessons Learned</w:t>
+      </w:r>
+    </w:p>
+    <w:p>
+      <w:pPr>
+        <w:numPr>
+          <w:ilvl w:val="0"/>
+          <w:numId w:val="4"/>
+        </w:numPr>
+        <w:spacing w:after="0" w:afterAutospacing="0"/>
+        <w:ind w:left="720" w:hanging="360"/>
+        <w:rPr>
+          <w:rFonts w:ascii="Calibri" w:cs="Calibri" w:eastAsia="Calibri" w:hAnsi="Calibri"/>
+          <w:sz w:val="24"/>
+          <w:szCs w:val="24"/>
+        </w:rPr>
+      </w:pPr>
+      <w:r>
+        <w:rPr>
+          <w:rFonts w:ascii="Calibri" w:cs="Calibri" w:eastAsia="Calibri" w:hAnsi="Calibri"/>
+          <w:sz w:val="24"/>
+          <w:szCs w:val="24"/>
+          <w:rtl w:val="0"/>
+        </w:rPr>
+        <w:t xml:space="preserve">Rules vs ML: rules explain DoS/port scan; ML generalizes but KDDTest+ recall is 62.2%.</w:t>
+      </w:r>
+    </w:p>
+    <w:p>
+      <w:pPr>
+        <w:numPr>
+          <w:ilvl w:val="0"/>
+          <w:numId w:val="4"/>
+        </w:numPr>
+        <w:spacing w:after="0" w:afterAutospacing="0"/>
+        <w:ind w:left="720" w:hanging="360"/>
+        <w:rPr>
+          <w:rFonts w:ascii="Calibri" w:cs="Calibri" w:eastAsia="Calibri" w:hAnsi="Calibri"/>
+          <w:sz w:val="24"/>
+          <w:szCs w:val="24"/>
+        </w:rPr>
+      </w:pPr>
+      <w:r>
+        <w:rPr>
+          <w:rFonts w:ascii="Calibri" w:cs="Calibri" w:eastAsia="Calibri" w:hAnsi="Calibri"/>
+          <w:sz w:val="24"/>
+          <w:szCs w:val="24"/>
+          <w:rtl w:val="0"/>
+        </w:rPr>
+        <w:t xml:space="preserve">Lab constraints: sudo/Npcap required; ethical demos documented in attack-readme.md.</w:t>
+      </w:r>
+    </w:p>
+    <w:p>
+      <w:pPr>
+        <w:numPr>
+          <w:ilvl w:val="0"/>
+          <w:numId w:val="4"/>
+        </w:numPr>
+        <w:spacing w:after="0" w:afterAutospacing="0"/>
+        <w:ind w:left="720" w:hanging="360"/>
+        <w:rPr>
+          <w:rFonts w:ascii="Calibri" w:cs="Calibri" w:eastAsia="Calibri" w:hAnsi="Calibri"/>
+          <w:sz w:val="24"/>
+          <w:szCs w:val="24"/>
+        </w:rPr>
+      </w:pPr>
+      <w:r>
+        <w:rPr>
+          <w:rFonts w:ascii="Calibri" w:cs="Calibri" w:eastAsia="Calibri" w:hAnsi="Calibri"/>
+          <w:sz w:val="24"/>
+          <w:szCs w:val="24"/>
+          <w:rtl w:val="0"/>
+        </w:rPr>
+        <w:t xml:space="preserve">Scope discipline kept the capstone focused; 41-feature train/runtime alignment prevented integration bugs.</w:t>
+      </w:r>
+    </w:p>
+    <w:p>
+      <w:pPr>
+        <w:numPr>
+          <w:ilvl w:val="0"/>
+          <w:numId w:val="4"/>
+        </w:numPr>
+        <w:ind w:left="720" w:hanging="360"/>
+        <w:rPr>
+          <w:rFonts w:ascii="Calibri" w:cs="Calibri" w:eastAsia="Calibri" w:hAnsi="Calibri"/>
+          <w:sz w:val="24"/>
+          <w:szCs w:val="24"/>
+        </w:rPr>
+      </w:pPr>
+      <w:r>
+        <w:rPr>
+          <w:rFonts w:ascii="Calibri" w:cs="Calibri" w:eastAsia="Calibri" w:hAnsi="Calibri"/>
+          <w:sz w:val="24"/>
+          <w:szCs w:val="24"/>
+          <w:rtl w:val="0"/>
+        </w:rPr>
+        <w:t xml:space="preserve">If starting again: evaluate CICIDS2017 earlier, add API authentication, export CSV logs for grading.</w:t>
+      </w:r>
+    </w:p>
+    <w:p>
+      <w:pPr>
+        <w:rPr>
+          <w:rFonts w:ascii="Calibri" w:cs="Calibri" w:eastAsia="Calibri" w:hAnsi="Calibri"/>
+          <w:b w:val="1"/>
+          <w:bCs w:val="1"/>
+          <w:color w:val="4f81bd"/>
+          <w:sz w:val="28"/>
+          <w:szCs w:val="28"/>
+        </w:rPr>
+      </w:pPr>
+      <w:r>
+        <w:rPr>
+          <w:rFonts w:ascii="Calibri" w:cs="Calibri" w:eastAsia="Calibri" w:hAnsi="Calibri"/>
+          <w:b w:val="1"/>
+          <w:bCs w:val="1"/>
+          <w:color w:val="4f81bd"/>
+          <w:sz w:val="28"/>
+          <w:szCs w:val="28"/>
+          <w:rtl w:val="0"/>
+        </w:rPr>
+        <w:t xml:space="preserve">13. Threat Model</w:t>
+      </w:r>
+    </w:p>
+    <w:p>
+      <w:pPr>
+        <w:rPr>
+          <w:rFonts w:ascii="Calibri" w:cs="Calibri" w:eastAsia="Calibri" w:hAnsi="Calibri"/>
+          <w:sz w:val="24"/>
+          <w:szCs w:val="24"/>
+        </w:rPr>
+      </w:pPr>
+      <w:r>
+        <w:rPr>
+          <w:rFonts w:ascii="Calibri" w:cs="Calibri" w:eastAsia="Calibri" w:hAnsi="Calibri"/>
+          <w:sz w:val="24"/>
+          <w:szCs w:val="24"/>
+          <w:rtl w:val="0"/>
+        </w:rPr>
+        <w:t xml:space="preserve">A lightweight STRIDE-style analysis for lab deployment. NetGuard AI targets controlled educational networks.</w:t>
+      </w:r>
+    </w:p>
+    <w:p>
+      <w:pPr>
+        <w:rPr>
+          <w:rFonts w:ascii="Calibri" w:cs="Calibri" w:eastAsia="Calibri" w:hAnsi="Calibri"/>
+          <w:b w:val="1"/>
+          <w:bCs w:val="1"/>
+          <w:color w:val="4f81bd"/>
+          <w:sz w:val="26"/>
+          <w:szCs w:val="26"/>
+        </w:rPr>
+      </w:pPr>
+      <w:r>
+        <w:rPr>
+          <w:rFonts w:ascii="Calibri" w:cs="Calibri" w:eastAsia="Calibri" w:hAnsi="Calibri"/>
+          <w:b w:val="1"/>
+          <w:bCs w:val="1"/>
+          <w:color w:val="4f81bd"/>
+          <w:sz w:val="26"/>
+          <w:szCs w:val="26"/>
+          <w:rtl w:val="0"/>
+        </w:rPr>
+        <w:t xml:space="preserve">13.1 Assets</w:t>
+      </w:r>
+    </w:p>
+    <w:tbl>
+      <w:tblPr>
+        <w:tblStyle w:val="Table10"/>
+        <w:tblW w:w="9360.0" w:type="dxa"/>
+        <w:jc w:val="left"/>
+        <w:tblBorders>
+          <w:top w:color="000000" w:space="0" w:sz="4" w:val="single"/>
+          <w:left w:color="000000" w:space="0" w:sz="4" w:val="single"/>
+          <w:bottom w:color="000000" w:space="0" w:sz="4" w:val="single"/>
+          <w:right w:color="000000" w:space="0" w:sz="4" w:val="single"/>
+          <w:insideH w:color="000000" w:space="0" w:sz="4" w:val="single"/>
+          <w:insideV w:color="000000" w:space="0" w:sz="4" w:val="single"/>
+        </w:tblBorders>
+        <w:tblLayout w:type="fixed"/>
+        <w:tblLook w:val="0400"/>
+      </w:tblPr>
+      <w:tblGrid>
+        <w:gridCol w:w="3120"/>
+        <w:gridCol w:w="3120"/>
+        <w:gridCol w:w="3120"/>
+        <w:tblGridChange w:id="0">
+          <w:tblGrid>
+            <w:gridCol w:w="3120"/>
+            <w:gridCol w:w="3120"/>
+            <w:gridCol w:w="3120"/>
+          </w:tblGrid>
+        </w:tblGridChange>
+      </w:tblGrid>
+      <w:tr>
+        <w:trPr>
+          <w:cantSplit w:val="0"/>
+          <w:tblHeader w:val="0"/>
+        </w:trPr>
+        <w:tc>
+          <w:tcPr/>
+          <w:p>
+            <w:pPr>
+              <w:rPr>
+                <w:rFonts w:ascii="Calibri" w:cs="Calibri" w:eastAsia="Calibri" w:hAnsi="Calibri"/>
+                <w:sz w:val="24"/>
+                <w:szCs w:val="24"/>
+              </w:rPr>
+            </w:pPr>
+            <w:r>
+              <w:rPr>
+                <w:rFonts w:ascii="Calibri" w:cs="Calibri" w:eastAsia="Calibri" w:hAnsi="Calibri"/>
+                <w:sz w:val="24"/>
+                <w:szCs w:val="24"/>
+                <w:rtl w:val="0"/>
+              </w:rPr>
+              <w:t xml:space="preserve">Asset</w:t>
+            </w:r>
+          </w:p>
+        </w:tc>
+        <w:tc>
+          <w:tcPr/>
+          <w:p>
+            <w:pPr>
+              <w:rPr>
+                <w:rFonts w:ascii="Calibri" w:cs="Calibri" w:eastAsia="Calibri" w:hAnsi="Calibri"/>
+                <w:sz w:val="24"/>
+                <w:szCs w:val="24"/>
+              </w:rPr>
+            </w:pPr>
+            <w:r>
+              <w:rPr>
+                <w:rFonts w:ascii="Calibri" w:cs="Calibri" w:eastAsia="Calibri" w:hAnsi="Calibri"/>
+                <w:sz w:val="24"/>
+                <w:szCs w:val="24"/>
+                <w:rtl w:val="0"/>
+              </w:rPr>
+              <w:t xml:space="preserve">Description</w:t>
+            </w:r>
+          </w:p>
+        </w:tc>
+        <w:tc>
+          <w:tcPr/>
+          <w:p>
+            <w:pPr>
+              <w:rPr>
+                <w:rFonts w:ascii="Calibri" w:cs="Calibri" w:eastAsia="Calibri" w:hAnsi="Calibri"/>
+                <w:sz w:val="24"/>
+                <w:szCs w:val="24"/>
+              </w:rPr>
+            </w:pPr>
+            <w:r>
+              <w:rPr>
+                <w:rFonts w:ascii="Calibri" w:cs="Calibri" w:eastAsia="Calibri" w:hAnsi="Calibri"/>
+                <w:sz w:val="24"/>
+                <w:szCs w:val="24"/>
+                <w:rtl w:val="0"/>
+              </w:rPr>
+              <w:t xml:space="preserve">Sensitivity</w:t>
+            </w:r>
+          </w:p>
+        </w:tc>
+      </w:tr>
+      <w:tr>
+        <w:trPr>
+          <w:cantSplit w:val="0"/>
+          <w:tblHeader w:val="0"/>
+        </w:trPr>
+        <w:tc>
+          <w:tcPr/>
+          <w:p>
+            <w:pPr>
+              <w:rPr>
+                <w:rFonts w:ascii="Calibri" w:cs="Calibri" w:eastAsia="Calibri" w:hAnsi="Calibri"/>
+                <w:sz w:val="24"/>
+                <w:szCs w:val="24"/>
+              </w:rPr>
+            </w:pPr>
+            <w:r>
+              <w:rPr>
+                <w:rFonts w:ascii="Calibri" w:cs="Calibri" w:eastAsia="Calibri" w:hAnsi="Calibri"/>
+                <w:sz w:val="24"/>
+                <w:szCs w:val="24"/>
+                <w:rtl w:val="0"/>
+              </w:rPr>
+              <w:t xml:space="preserve">Traffic metadata</w:t>
+            </w:r>
+          </w:p>
+        </w:tc>
+        <w:tc>
+          <w:tcPr/>
+          <w:p>
+            <w:pPr>
+              <w:rPr>
+                <w:rFonts w:ascii="Calibri" w:cs="Calibri" w:eastAsia="Calibri" w:hAnsi="Calibri"/>
+                <w:sz w:val="24"/>
+                <w:szCs w:val="24"/>
+              </w:rPr>
+            </w:pPr>
+            <w:r>
+              <w:rPr>
+                <w:rFonts w:ascii="Calibri" w:cs="Calibri" w:eastAsia="Calibri" w:hAnsi="Calibri"/>
+                <w:sz w:val="24"/>
+                <w:szCs w:val="24"/>
+                <w:rtl w:val="0"/>
+              </w:rPr>
+              <w:t xml:space="preserve">Flow features, IPs, ports</w:t>
+            </w:r>
+          </w:p>
+        </w:tc>
+        <w:tc>
+          <w:tcPr/>
+          <w:p>
+            <w:pPr>
+              <w:rPr>
+                <w:rFonts w:ascii="Calibri" w:cs="Calibri" w:eastAsia="Calibri" w:hAnsi="Calibri"/>
+                <w:sz w:val="24"/>
+                <w:szCs w:val="24"/>
+              </w:rPr>
+            </w:pPr>
+            <w:r>
+              <w:rPr>
+                <w:rFonts w:ascii="Calibri" w:cs="Calibri" w:eastAsia="Calibri" w:hAnsi="Calibri"/>
+                <w:sz w:val="24"/>
+                <w:szCs w:val="24"/>
+                <w:rtl w:val="0"/>
+              </w:rPr>
+              <w:t xml:space="preserve">Medium</w:t>
+            </w:r>
+          </w:p>
+        </w:tc>
+      </w:tr>
+      <w:tr>
+        <w:trPr>
+          <w:cantSplit w:val="0"/>
+          <w:tblHeader w:val="0"/>
+        </w:trPr>
+        <w:tc>
+          <w:tcPr/>
+          <w:p>
+            <w:pPr>
+              <w:rPr>
+                <w:rFonts w:ascii="Calibri" w:cs="Calibri" w:eastAsia="Calibri" w:hAnsi="Calibri"/>
+                <w:sz w:val="24"/>
+                <w:szCs w:val="24"/>
+              </w:rPr>
+            </w:pPr>
+            <w:r>
+              <w:rPr>
+                <w:rFonts w:ascii="Calibri" w:cs="Calibri" w:eastAsia="Calibri" w:hAnsi="Calibri"/>
+                <w:sz w:val="24"/>
+                <w:szCs w:val="24"/>
+                <w:rtl w:val="0"/>
+              </w:rPr>
+              <w:t xml:space="preserve">ML model + encoders</w:t>
+            </w:r>
+          </w:p>
+        </w:tc>
+        <w:tc>
+          <w:tcPr/>
+          <w:p>
+            <w:pPr>
+              <w:rPr>
+                <w:rFonts w:ascii="Calibri" w:cs="Calibri" w:eastAsia="Calibri" w:hAnsi="Calibri"/>
+                <w:sz w:val="24"/>
+                <w:szCs w:val="24"/>
+              </w:rPr>
+            </w:pPr>
+            <w:r>
+              <w:rPr>
+                <w:rFonts w:ascii="Calibri" w:cs="Calibri" w:eastAsia="Calibri" w:hAnsi="Calibri"/>
+                <w:sz w:val="24"/>
+                <w:szCs w:val="24"/>
+                <w:rtl w:val="0"/>
+              </w:rPr>
+              <w:t xml:space="preserve">model.pkl, encoders.pkl</w:t>
+            </w:r>
+          </w:p>
+        </w:tc>
+        <w:tc>
+          <w:tcPr/>
+          <w:p>
+            <w:pPr>
+              <w:rPr>
+                <w:rFonts w:ascii="Calibri" w:cs="Calibri" w:eastAsia="Calibri" w:hAnsi="Calibri"/>
+                <w:sz w:val="24"/>
+                <w:szCs w:val="24"/>
+              </w:rPr>
+            </w:pPr>
+            <w:r>
+              <w:rPr>
+                <w:rFonts w:ascii="Calibri" w:cs="Calibri" w:eastAsia="Calibri" w:hAnsi="Calibri"/>
+                <w:sz w:val="24"/>
+                <w:szCs w:val="24"/>
+                <w:rtl w:val="0"/>
+              </w:rPr>
+              <w:t xml:space="preserve">Medium</w:t>
+            </w:r>
+          </w:p>
+        </w:tc>
+      </w:tr>
+      <w:tr>
+        <w:trPr>
+          <w:cantSplit w:val="0"/>
+          <w:tblHeader w:val="0"/>
+        </w:trPr>
+        <w:tc>
+          <w:tcPr/>
+          <w:p>
+            <w:pPr>
+              <w:rPr>
+                <w:rFonts w:ascii="Calibri" w:cs="Calibri" w:eastAsia="Calibri" w:hAnsi="Calibri"/>
+                <w:sz w:val="24"/>
+                <w:szCs w:val="24"/>
+              </w:rPr>
+            </w:pPr>
+            <w:r>
+              <w:rPr>
+                <w:rFonts w:ascii="Calibri" w:cs="Calibri" w:eastAsia="Calibri" w:hAnsi="Calibri"/>
+                <w:sz w:val="24"/>
+                <w:szCs w:val="24"/>
+                <w:rtl w:val="0"/>
+              </w:rPr>
+              <w:t xml:space="preserve">PostgreSQL</w:t>
+            </w:r>
+          </w:p>
+        </w:tc>
+        <w:tc>
+          <w:tcPr/>
+          <w:p>
+            <w:pPr>
+              <w:rPr>
+                <w:rFonts w:ascii="Calibri" w:cs="Calibri" w:eastAsia="Calibri" w:hAnsi="Calibri"/>
+                <w:sz w:val="24"/>
+                <w:szCs w:val="24"/>
+              </w:rPr>
+            </w:pPr>
+            <w:r>
+              <w:rPr>
+                <w:rFonts w:ascii="Calibri" w:cs="Calibri" w:eastAsia="Calibri" w:hAnsi="Calibri"/>
+                <w:sz w:val="24"/>
+                <w:szCs w:val="24"/>
+                <w:rtl w:val="0"/>
+              </w:rPr>
+              <w:t xml:space="preserve">traffic_logs, alerts</w:t>
+            </w:r>
+          </w:p>
+        </w:tc>
+        <w:tc>
+          <w:tcPr/>
+          <w:p>
+            <w:pPr>
+              <w:rPr>
+                <w:rFonts w:ascii="Calibri" w:cs="Calibri" w:eastAsia="Calibri" w:hAnsi="Calibri"/>
+                <w:sz w:val="24"/>
+                <w:szCs w:val="24"/>
+              </w:rPr>
+            </w:pPr>
+            <w:r>
+              <w:rPr>
+                <w:rFonts w:ascii="Calibri" w:cs="Calibri" w:eastAsia="Calibri" w:hAnsi="Calibri"/>
+                <w:sz w:val="24"/>
+                <w:szCs w:val="24"/>
+                <w:rtl w:val="0"/>
+              </w:rPr>
+              <w:t xml:space="preserve">High</w:t>
+            </w:r>
+          </w:p>
+        </w:tc>
+      </w:tr>
+      <w:tr>
+        <w:trPr>
+          <w:cantSplit w:val="0"/>
+          <w:tblHeader w:val="0"/>
+        </w:trPr>
+        <w:tc>
+          <w:tcPr/>
+          <w:p>
+            <w:pPr>
+              <w:rPr>
+                <w:rFonts w:ascii="Calibri" w:cs="Calibri" w:eastAsia="Calibri" w:hAnsi="Calibri"/>
+                <w:sz w:val="24"/>
+                <w:szCs w:val="24"/>
+              </w:rPr>
+            </w:pPr>
+            <w:r>
+              <w:rPr>
+                <w:rFonts w:ascii="Calibri" w:cs="Calibri" w:eastAsia="Calibri" w:hAnsi="Calibri"/>
+                <w:sz w:val="24"/>
+                <w:szCs w:val="24"/>
+                <w:rtl w:val="0"/>
+              </w:rPr>
+              <w:t xml:space="preserve">Backend / ML APIs</w:t>
+            </w:r>
+          </w:p>
+        </w:tc>
+        <w:tc>
+          <w:tcPr/>
+          <w:p>
+            <w:pPr>
+              <w:rPr>
+                <w:rFonts w:ascii="Calibri" w:cs="Calibri" w:eastAsia="Calibri" w:hAnsi="Calibri"/>
+                <w:sz w:val="24"/>
+                <w:szCs w:val="24"/>
+              </w:rPr>
+            </w:pPr>
+            <w:r>
+              <w:rPr>
+                <w:rFonts w:ascii="Calibri" w:cs="Calibri" w:eastAsia="Calibri" w:hAnsi="Calibri"/>
+                <w:sz w:val="24"/>
+                <w:szCs w:val="24"/>
+                <w:rtl w:val="0"/>
+              </w:rPr>
+              <w:t xml:space="preserve">Ports 5000, 8000</w:t>
+            </w:r>
+          </w:p>
+        </w:tc>
+        <w:tc>
+          <w:tcPr/>
+          <w:p>
+            <w:pPr>
+              <w:rPr>
+                <w:rFonts w:ascii="Calibri" w:cs="Calibri" w:eastAsia="Calibri" w:hAnsi="Calibri"/>
+                <w:sz w:val="24"/>
+                <w:szCs w:val="24"/>
+              </w:rPr>
+            </w:pPr>
+            <w:r>
+              <w:rPr>
+                <w:rFonts w:ascii="Calibri" w:cs="Calibri" w:eastAsia="Calibri" w:hAnsi="Calibri"/>
+                <w:sz w:val="24"/>
+                <w:szCs w:val="24"/>
+                <w:rtl w:val="0"/>
+              </w:rPr>
+              <w:t xml:space="preserve">High</w:t>
+            </w:r>
+          </w:p>
+        </w:tc>
+      </w:tr>
+      <w:tr>
+        <w:trPr>
+          <w:cantSplit w:val="0"/>
+          <w:tblHeader w:val="0"/>
+        </w:trPr>
+        <w:tc>
+          <w:tcPr/>
+          <w:p>
+            <w:pPr>
+              <w:rPr>
+                <w:rFonts w:ascii="Calibri" w:cs="Calibri" w:eastAsia="Calibri" w:hAnsi="Calibri"/>
+                <w:sz w:val="24"/>
+                <w:szCs w:val="24"/>
+              </w:rPr>
+            </w:pPr>
+            <w:r>
+              <w:rPr>
+                <w:rFonts w:ascii="Calibri" w:cs="Calibri" w:eastAsia="Calibri" w:hAnsi="Calibri"/>
+                <w:sz w:val="24"/>
+                <w:szCs w:val="24"/>
+                <w:rtl w:val="0"/>
+              </w:rPr>
+              <w:t xml:space="preserve">Live sniffer</w:t>
+            </w:r>
+          </w:p>
+        </w:tc>
+        <w:tc>
+          <w:tcPr/>
+          <w:p>
+            <w:pPr>
+              <w:rPr>
+                <w:rFonts w:ascii="Calibri" w:cs="Calibri" w:eastAsia="Calibri" w:hAnsi="Calibri"/>
+                <w:sz w:val="24"/>
+                <w:szCs w:val="24"/>
+              </w:rPr>
+            </w:pPr>
+            <w:r>
+              <w:rPr>
+                <w:rFonts w:ascii="Calibri" w:cs="Calibri" w:eastAsia="Calibri" w:hAnsi="Calibri"/>
+                <w:sz w:val="24"/>
+                <w:szCs w:val="24"/>
+                <w:rtl w:val="0"/>
+              </w:rPr>
+              <w:t xml:space="preserve">Scapy (often root)</w:t>
+            </w:r>
+          </w:p>
+        </w:tc>
+        <w:tc>
+          <w:tcPr/>
+          <w:p>
+            <w:pPr>
+              <w:rPr>
+                <w:rFonts w:ascii="Calibri" w:cs="Calibri" w:eastAsia="Calibri" w:hAnsi="Calibri"/>
+                <w:sz w:val="24"/>
+                <w:szCs w:val="24"/>
+              </w:rPr>
+            </w:pPr>
+            <w:r>
+              <w:rPr>
+                <w:rFonts w:ascii="Calibri" w:cs="Calibri" w:eastAsia="Calibri" w:hAnsi="Calibri"/>
+                <w:sz w:val="24"/>
+                <w:szCs w:val="24"/>
+                <w:rtl w:val="0"/>
+              </w:rPr>
+              <w:t xml:space="preserve">High</w:t>
+            </w:r>
+          </w:p>
+        </w:tc>
+      </w:tr>
+      <w:tr>
+        <w:trPr>
+          <w:cantSplit w:val="0"/>
+          <w:tblHeader w:val="0"/>
+        </w:trPr>
+        <w:tc>
+          <w:tcPr/>
+          <w:p>
+            <w:pPr>
+              <w:rPr>
+                <w:rFonts w:ascii="Calibri" w:cs="Calibri" w:eastAsia="Calibri" w:hAnsi="Calibri"/>
+                <w:sz w:val="24"/>
+                <w:szCs w:val="24"/>
+              </w:rPr>
+            </w:pPr>
+            <w:r>
+              <w:rPr>
+                <w:rFonts w:ascii="Calibri" w:cs="Calibri" w:eastAsia="Calibri" w:hAnsi="Calibri"/>
+                <w:sz w:val="24"/>
+                <w:szCs w:val="24"/>
+                <w:rtl w:val="0"/>
+              </w:rPr>
+              <w:t xml:space="preserve">Dashboard</w:t>
+            </w:r>
+          </w:p>
+        </w:tc>
+        <w:tc>
+          <w:tcPr/>
+          <w:p>
+            <w:pPr>
+              <w:rPr>
+                <w:rFonts w:ascii="Calibri" w:cs="Calibri" w:eastAsia="Calibri" w:hAnsi="Calibri"/>
+                <w:sz w:val="24"/>
+                <w:szCs w:val="24"/>
+              </w:rPr>
+            </w:pPr>
+            <w:r>
+              <w:rPr>
+                <w:rFonts w:ascii="Calibri" w:cs="Calibri" w:eastAsia="Calibri" w:hAnsi="Calibri"/>
+                <w:sz w:val="24"/>
+                <w:szCs w:val="24"/>
+                <w:rtl w:val="0"/>
+              </w:rPr>
+              <w:t xml:space="preserve">React UI :5173</w:t>
+            </w:r>
+          </w:p>
+        </w:tc>
+        <w:tc>
+          <w:tcPr/>
+          <w:p>
+            <w:pPr>
+              <w:rPr>
+                <w:rFonts w:ascii="Calibri" w:cs="Calibri" w:eastAsia="Calibri" w:hAnsi="Calibri"/>
+                <w:sz w:val="24"/>
+                <w:szCs w:val="24"/>
+              </w:rPr>
+            </w:pPr>
+            <w:r>
+              <w:rPr>
+                <w:rFonts w:ascii="Calibri" w:cs="Calibri" w:eastAsia="Calibri" w:hAnsi="Calibri"/>
+                <w:sz w:val="24"/>
+                <w:szCs w:val="24"/>
+                <w:rtl w:val="0"/>
+              </w:rPr>
+              <w:t xml:space="preserve">Medium</w:t>
+            </w:r>
+          </w:p>
+        </w:tc>
+      </w:tr>
+    </w:tbl>
+    <w:p>
+      <w:pPr>
+        <w:rPr>
+          <w:rFonts w:ascii="Calibri" w:cs="Calibri" w:eastAsia="Calibri" w:hAnsi="Calibri"/>
+          <w:b w:val="1"/>
+          <w:bCs w:val="1"/>
+          <w:color w:val="4f81bd"/>
+          <w:sz w:val="26"/>
+          <w:szCs w:val="26"/>
+        </w:rPr>
+      </w:pPr>
+      <w:r>
+        <w:rPr>
+          <w:rFonts w:ascii="Calibri" w:cs="Calibri" w:eastAsia="Calibri" w:hAnsi="Calibri"/>
+          <w:b w:val="1"/>
+          <w:bCs w:val="1"/>
+          <w:color w:val="4f81bd"/>
+          <w:sz w:val="26"/>
+          <w:szCs w:val="26"/>
+          <w:rtl w:val="0"/>
+        </w:rPr>
+        <w:t xml:space="preserve">13.2 Threat Actors</w:t>
+      </w:r>
+    </w:p>
+    <w:p>
+      <w:pPr>
+        <w:rPr>
+          <w:rFonts w:ascii="Calibri" w:cs="Calibri" w:eastAsia="Calibri" w:hAnsi="Calibri"/>
+          <w:sz w:val="24"/>
+          <w:szCs w:val="24"/>
+        </w:rPr>
+      </w:pPr>
+      <w:r>
+        <w:rPr>
+          <w:rFonts w:ascii="Calibri" w:cs="Calibri" w:eastAsia="Calibri" w:hAnsi="Calibri"/>
+          <w:sz w:val="24"/>
+          <w:szCs w:val="24"/>
+          <w:rtl w:val="0"/>
+        </w:rPr>
+        <w:t xml:space="preserve">External attacker (DoS, scan); insider/student (misconfiguration); operator (over-reliance on dashboard).</w:t>
+      </w:r>
+    </w:p>
+    <w:p>
+      <w:pPr>
+        <w:rPr>
+          <w:rFonts w:ascii="Calibri" w:cs="Calibri" w:eastAsia="Calibri" w:hAnsi="Calibri"/>
+          <w:b w:val="1"/>
+          <w:bCs w:val="1"/>
+          <w:color w:val="4f81bd"/>
+          <w:sz w:val="26"/>
+          <w:szCs w:val="26"/>
+        </w:rPr>
+      </w:pPr>
+      <w:r>
+        <w:rPr>
+          <w:rFonts w:ascii="Calibri" w:cs="Calibri" w:eastAsia="Calibri" w:hAnsi="Calibri"/>
+          <w:b w:val="1"/>
+          <w:bCs w:val="1"/>
+          <w:color w:val="4f81bd"/>
+          <w:sz w:val="26"/>
+          <w:szCs w:val="26"/>
+          <w:rtl w:val="0"/>
+        </w:rPr>
+        <w:t xml:space="preserve">13.3 Attack Vectors and Mitigations</w:t>
+      </w:r>
+    </w:p>
+    <w:tbl>
+      <w:tblPr>
+        <w:tblStyle w:val="Table11"/>
+        <w:tblW w:w="9360.0" w:type="dxa"/>
+        <w:jc w:val="left"/>
+        <w:tblBorders>
+          <w:top w:color="000000" w:space="0" w:sz="4" w:val="single"/>
+          <w:left w:color="000000" w:space="0" w:sz="4" w:val="single"/>
+          <w:bottom w:color="000000" w:space="0" w:sz="4" w:val="single"/>
+          <w:right w:color="000000" w:space="0" w:sz="4" w:val="single"/>
+          <w:insideH w:color="000000" w:space="0" w:sz="4" w:val="single"/>
+          <w:insideV w:color="000000" w:space="0" w:sz="4" w:val="single"/>
+        </w:tblBorders>
+        <w:tblLayout w:type="fixed"/>
+        <w:tblLook w:val="0400"/>
+      </w:tblPr>
+      <w:tblGrid>
+        <w:gridCol w:w="2340"/>
+        <w:gridCol w:w="2340"/>
+        <w:gridCol w:w="2340"/>
+        <w:gridCol w:w="2340"/>
+        <w:tblGridChange w:id="0">
+          <w:tblGrid>
+            <w:gridCol w:w="2340"/>
+            <w:gridCol w:w="2340"/>
+            <w:gridCol w:w="2340"/>
+            <w:gridCol w:w="2340"/>
+          </w:tblGrid>
+        </w:tblGridChange>
+      </w:tblGrid>
+      <w:tr>
+        <w:trPr>
+          <w:cantSplit w:val="0"/>
+          <w:tblHeader w:val="0"/>
+        </w:trPr>
+        <w:tc>
+          <w:tcPr/>
+          <w:p>
+            <w:pPr>
+              <w:rPr>
+                <w:rFonts w:ascii="Calibri" w:cs="Calibri" w:eastAsia="Calibri" w:hAnsi="Calibri"/>
+                <w:sz w:val="24"/>
+                <w:szCs w:val="24"/>
+              </w:rPr>
+            </w:pPr>
+            <w:r>
+              <w:rPr>
+                <w:rFonts w:ascii="Calibri" w:cs="Calibri" w:eastAsia="Calibri" w:hAnsi="Calibri"/>
+                <w:sz w:val="24"/>
+                <w:szCs w:val="24"/>
+                <w:rtl w:val="0"/>
+              </w:rPr>
+              <w:t xml:space="preserve">Vector</w:t>
+            </w:r>
+          </w:p>
+        </w:tc>
+        <w:tc>
+          <w:tcPr/>
+          <w:p>
+            <w:pPr>
+              <w:rPr>
+                <w:rFonts w:ascii="Calibri" w:cs="Calibri" w:eastAsia="Calibri" w:hAnsi="Calibri"/>
+                <w:sz w:val="24"/>
+                <w:szCs w:val="24"/>
+              </w:rPr>
+            </w:pPr>
+            <w:r>
+              <w:rPr>
+                <w:rFonts w:ascii="Calibri" w:cs="Calibri" w:eastAsia="Calibri" w:hAnsi="Calibri"/>
+                <w:sz w:val="24"/>
+                <w:szCs w:val="24"/>
+                <w:rtl w:val="0"/>
+              </w:rPr>
+              <w:t xml:space="preserve">Example</w:t>
+            </w:r>
+          </w:p>
+        </w:tc>
+        <w:tc>
+          <w:tcPr/>
+          <w:p>
+            <w:pPr>
+              <w:rPr>
+                <w:rFonts w:ascii="Calibri" w:cs="Calibri" w:eastAsia="Calibri" w:hAnsi="Calibri"/>
+                <w:sz w:val="24"/>
+                <w:szCs w:val="24"/>
+              </w:rPr>
+            </w:pPr>
+            <w:r>
+              <w:rPr>
+                <w:rFonts w:ascii="Calibri" w:cs="Calibri" w:eastAsia="Calibri" w:hAnsi="Calibri"/>
+                <w:sz w:val="24"/>
+                <w:szCs w:val="24"/>
+                <w:rtl w:val="0"/>
+              </w:rPr>
+              <w:t xml:space="preserve">Detection</w:t>
+            </w:r>
+          </w:p>
+        </w:tc>
+        <w:tc>
+          <w:tcPr/>
+          <w:p>
+            <w:pPr>
+              <w:rPr>
+                <w:rFonts w:ascii="Calibri" w:cs="Calibri" w:eastAsia="Calibri" w:hAnsi="Calibri"/>
+                <w:sz w:val="24"/>
+                <w:szCs w:val="24"/>
+              </w:rPr>
+            </w:pPr>
+            <w:r>
+              <w:rPr>
+                <w:rFonts w:ascii="Calibri" w:cs="Calibri" w:eastAsia="Calibri" w:hAnsi="Calibri"/>
+                <w:sz w:val="24"/>
+                <w:szCs w:val="24"/>
+                <w:rtl w:val="0"/>
+              </w:rPr>
+              <w:t xml:space="preserve">Limitation</w:t>
+            </w:r>
+          </w:p>
+        </w:tc>
+      </w:tr>
+      <w:tr>
+        <w:trPr>
+          <w:cantSplit w:val="0"/>
+          <w:tblHeader w:val="0"/>
+        </w:trPr>
+        <w:tc>
+          <w:tcPr/>
+          <w:p>
+            <w:pPr>
+              <w:rPr>
+                <w:rFonts w:ascii="Calibri" w:cs="Calibri" w:eastAsia="Calibri" w:hAnsi="Calibri"/>
+                <w:sz w:val="24"/>
+                <w:szCs w:val="24"/>
+              </w:rPr>
+            </w:pPr>
+            <w:r>
+              <w:rPr>
+                <w:rFonts w:ascii="Calibri" w:cs="Calibri" w:eastAsia="Calibri" w:hAnsi="Calibri"/>
+                <w:sz w:val="24"/>
+                <w:szCs w:val="24"/>
+                <w:rtl w:val="0"/>
+              </w:rPr>
+              <w:t xml:space="preserve">DoS / SYN flood</w:t>
+            </w:r>
+          </w:p>
+        </w:tc>
+        <w:tc>
+          <w:tcPr/>
+          <w:p>
+            <w:pPr>
+              <w:rPr>
+                <w:rFonts w:ascii="Calibri" w:cs="Calibri" w:eastAsia="Calibri" w:hAnsi="Calibri"/>
+                <w:sz w:val="24"/>
+                <w:szCs w:val="24"/>
+              </w:rPr>
+            </w:pPr>
+            <w:r>
+              <w:rPr>
+                <w:rFonts w:ascii="Calibri" w:cs="Calibri" w:eastAsia="Calibri" w:hAnsi="Calibri"/>
+                <w:sz w:val="24"/>
+                <w:szCs w:val="24"/>
+                <w:rtl w:val="0"/>
+              </w:rPr>
+              <w:t xml:space="preserve">hping3 in lab</w:t>
+            </w:r>
+          </w:p>
+        </w:tc>
+        <w:tc>
+          <w:tcPr/>
+          <w:p>
+            <w:pPr>
+              <w:rPr>
+                <w:rFonts w:ascii="Calibri" w:cs="Calibri" w:eastAsia="Calibri" w:hAnsi="Calibri"/>
+                <w:sz w:val="24"/>
+                <w:szCs w:val="24"/>
+              </w:rPr>
+            </w:pPr>
+            <w:r>
+              <w:rPr>
+                <w:rFonts w:ascii="Calibri" w:cs="Calibri" w:eastAsia="Calibri" w:hAnsi="Calibri"/>
+                <w:sz w:val="24"/>
+                <w:szCs w:val="24"/>
+                <w:rtl w:val="0"/>
+              </w:rPr>
+              <w:t xml:space="preserve">DoS rule thresholds</w:t>
+            </w:r>
+          </w:p>
+        </w:tc>
+        <w:tc>
+          <w:tcPr/>
+          <w:p>
+            <w:pPr>
+              <w:rPr>
+                <w:rFonts w:ascii="Calibri" w:cs="Calibri" w:eastAsia="Calibri" w:hAnsi="Calibri"/>
+                <w:sz w:val="24"/>
+                <w:szCs w:val="24"/>
+              </w:rPr>
+            </w:pPr>
+            <w:r>
+              <w:rPr>
+                <w:rFonts w:ascii="Calibri" w:cs="Calibri" w:eastAsia="Calibri" w:hAnsi="Calibri"/>
+                <w:sz w:val="24"/>
+                <w:szCs w:val="24"/>
+                <w:rtl w:val="0"/>
+              </w:rPr>
+              <w:t xml:space="preserve">Detection only</w:t>
+            </w:r>
+          </w:p>
+        </w:tc>
+      </w:tr>
+      <w:tr>
+        <w:trPr>
+          <w:cantSplit w:val="0"/>
+          <w:tblHeader w:val="0"/>
+        </w:trPr>
+        <w:tc>
+          <w:tcPr/>
+          <w:p>
+            <w:pPr>
+              <w:rPr>
+                <w:rFonts w:ascii="Calibri" w:cs="Calibri" w:eastAsia="Calibri" w:hAnsi="Calibri"/>
+                <w:sz w:val="24"/>
+                <w:szCs w:val="24"/>
+              </w:rPr>
+            </w:pPr>
+            <w:r>
+              <w:rPr>
+                <w:rFonts w:ascii="Calibri" w:cs="Calibri" w:eastAsia="Calibri" w:hAnsi="Calibri"/>
+                <w:sz w:val="24"/>
+                <w:szCs w:val="24"/>
+                <w:rtl w:val="0"/>
+              </w:rPr>
+              <w:t xml:space="preserve">Port scan</w:t>
+            </w:r>
+          </w:p>
+        </w:tc>
+        <w:tc>
+          <w:tcPr/>
+          <w:p>
+            <w:pPr>
+              <w:rPr>
+                <w:rFonts w:ascii="Calibri" w:cs="Calibri" w:eastAsia="Calibri" w:hAnsi="Calibri"/>
+                <w:sz w:val="24"/>
+                <w:szCs w:val="24"/>
+              </w:rPr>
+            </w:pPr>
+            <w:r>
+              <w:rPr>
+                <w:rFonts w:ascii="Calibri" w:cs="Calibri" w:eastAsia="Calibri" w:hAnsi="Calibri"/>
+                <w:sz w:val="24"/>
+                <w:szCs w:val="24"/>
+                <w:rtl w:val="0"/>
+              </w:rPr>
+              <w:t xml:space="preserve">nmap</w:t>
+            </w:r>
+          </w:p>
+        </w:tc>
+        <w:tc>
+          <w:tcPr/>
+          <w:p>
+            <w:pPr>
+              <w:rPr>
+                <w:rFonts w:ascii="Calibri" w:cs="Calibri" w:eastAsia="Calibri" w:hAnsi="Calibri"/>
+                <w:sz w:val="24"/>
+                <w:szCs w:val="24"/>
+              </w:rPr>
+            </w:pPr>
+            <w:r>
+              <w:rPr>
+                <w:rFonts w:ascii="Calibri" w:cs="Calibri" w:eastAsia="Calibri" w:hAnsi="Calibri"/>
+                <w:sz w:val="24"/>
+                <w:szCs w:val="24"/>
+                <w:rtl w:val="0"/>
+              </w:rPr>
+              <w:t xml:space="preserve">unique_dport_count rule</w:t>
+            </w:r>
+          </w:p>
+        </w:tc>
+        <w:tc>
+          <w:tcPr/>
+          <w:p>
+            <w:pPr>
+              <w:rPr>
+                <w:rFonts w:ascii="Calibri" w:cs="Calibri" w:eastAsia="Calibri" w:hAnsi="Calibri"/>
+                <w:sz w:val="24"/>
+                <w:szCs w:val="24"/>
+              </w:rPr>
+            </w:pPr>
+            <w:r>
+              <w:rPr>
+                <w:rFonts w:ascii="Calibri" w:cs="Calibri" w:eastAsia="Calibri" w:hAnsi="Calibri"/>
+                <w:sz w:val="24"/>
+                <w:szCs w:val="24"/>
+                <w:rtl w:val="0"/>
+              </w:rPr>
+              <w:t xml:space="preserve">Detection only</w:t>
+            </w:r>
+          </w:p>
+        </w:tc>
+      </w:tr>
+      <w:tr>
+        <w:trPr>
+          <w:cantSplit w:val="0"/>
+          <w:tblHeader w:val="0"/>
+        </w:trPr>
+        <w:tc>
+          <w:tcPr/>
+          <w:p>
+            <w:pPr>
+              <w:rPr>
+                <w:rFonts w:ascii="Calibri" w:cs="Calibri" w:eastAsia="Calibri" w:hAnsi="Calibri"/>
+                <w:sz w:val="24"/>
+                <w:szCs w:val="24"/>
+              </w:rPr>
+            </w:pPr>
+            <w:r>
+              <w:rPr>
+                <w:rFonts w:ascii="Calibri" w:cs="Calibri" w:eastAsia="Calibri" w:hAnsi="Calibri"/>
+                <w:sz w:val="24"/>
+                <w:szCs w:val="24"/>
+                <w:rtl w:val="0"/>
+              </w:rPr>
+              <w:t xml:space="preserve">ML evasion</w:t>
+            </w:r>
+          </w:p>
+        </w:tc>
+        <w:tc>
+          <w:tcPr/>
+          <w:p>
+            <w:pPr>
+              <w:rPr>
+                <w:rFonts w:ascii="Calibri" w:cs="Calibri" w:eastAsia="Calibri" w:hAnsi="Calibri"/>
+                <w:sz w:val="24"/>
+                <w:szCs w:val="24"/>
+              </w:rPr>
+            </w:pPr>
+            <w:r>
+              <w:rPr>
+                <w:rFonts w:ascii="Calibri" w:cs="Calibri" w:eastAsia="Calibri" w:hAnsi="Calibri"/>
+                <w:sz w:val="24"/>
+                <w:szCs w:val="24"/>
+                <w:rtl w:val="0"/>
+              </w:rPr>
+              <w:t xml:space="preserve">Crafted features</w:t>
+            </w:r>
+          </w:p>
+        </w:tc>
+        <w:tc>
+          <w:tcPr/>
+          <w:p>
+            <w:pPr>
+              <w:rPr>
+                <w:rFonts w:ascii="Calibri" w:cs="Calibri" w:eastAsia="Calibri" w:hAnsi="Calibri"/>
+                <w:sz w:val="24"/>
+                <w:szCs w:val="24"/>
+              </w:rPr>
+            </w:pPr>
+            <w:r>
+              <w:rPr>
+                <w:rFonts w:ascii="Calibri" w:cs="Calibri" w:eastAsia="Calibri" w:hAnsi="Calibri"/>
+                <w:sz w:val="24"/>
+                <w:szCs w:val="24"/>
+                <w:rtl w:val="0"/>
+              </w:rPr>
+              <w:t xml:space="preserve">RF probability ≥ 0.4</w:t>
+            </w:r>
+          </w:p>
+        </w:tc>
+        <w:tc>
+          <w:tcPr/>
+          <w:p>
+            <w:pPr>
+              <w:rPr>
+                <w:rFonts w:ascii="Calibri" w:cs="Calibri" w:eastAsia="Calibri" w:hAnsi="Calibri"/>
+                <w:sz w:val="24"/>
+                <w:szCs w:val="24"/>
+              </w:rPr>
+            </w:pPr>
+            <w:r>
+              <w:rPr>
+                <w:rFonts w:ascii="Calibri" w:cs="Calibri" w:eastAsia="Calibri" w:hAnsi="Calibri"/>
+                <w:sz w:val="24"/>
+                <w:szCs w:val="24"/>
+                <w:rtl w:val="0"/>
+              </w:rPr>
+              <w:t xml:space="preserve">Train/live gap</w:t>
+            </w:r>
+          </w:p>
+        </w:tc>
+      </w:tr>
+      <w:tr>
+        <w:trPr>
+          <w:cantSplit w:val="0"/>
+          <w:tblHeader w:val="0"/>
+        </w:trPr>
+        <w:tc>
+          <w:tcPr/>
+          <w:p>
+            <w:pPr>
+              <w:rPr>
+                <w:rFonts w:ascii="Calibri" w:cs="Calibri" w:eastAsia="Calibri" w:hAnsi="Calibri"/>
+                <w:sz w:val="24"/>
+                <w:szCs w:val="24"/>
+              </w:rPr>
+            </w:pPr>
+            <w:r>
+              <w:rPr>
+                <w:rFonts w:ascii="Calibri" w:cs="Calibri" w:eastAsia="Calibri" w:hAnsi="Calibri"/>
+                <w:sz w:val="24"/>
+                <w:szCs w:val="24"/>
+                <w:rtl w:val="0"/>
+              </w:rPr>
+              <w:t xml:space="preserve">Log tampering</w:t>
+            </w:r>
+          </w:p>
+        </w:tc>
+        <w:tc>
+          <w:tcPr/>
+          <w:p>
+            <w:pPr>
+              <w:rPr>
+                <w:rFonts w:ascii="Calibri" w:cs="Calibri" w:eastAsia="Calibri" w:hAnsi="Calibri"/>
+                <w:sz w:val="24"/>
+                <w:szCs w:val="24"/>
+              </w:rPr>
+            </w:pPr>
+            <w:r>
+              <w:rPr>
+                <w:rFonts w:ascii="Calibri" w:cs="Calibri" w:eastAsia="Calibri" w:hAnsi="Calibri"/>
+                <w:sz w:val="24"/>
+                <w:szCs w:val="24"/>
+                <w:rtl w:val="0"/>
+              </w:rPr>
+              <w:t xml:space="preserve">Direct DB edit</w:t>
+            </w:r>
+          </w:p>
+        </w:tc>
+        <w:tc>
+          <w:tcPr/>
+          <w:p>
+            <w:pPr>
+              <w:rPr>
+                <w:rFonts w:ascii="Calibri" w:cs="Calibri" w:eastAsia="Calibri" w:hAnsi="Calibri"/>
+                <w:sz w:val="24"/>
+                <w:szCs w:val="24"/>
+              </w:rPr>
+            </w:pPr>
+            <w:r>
+              <w:rPr>
+                <w:rFonts w:ascii="Calibri" w:cs="Calibri" w:eastAsia="Calibri" w:hAnsi="Calibri"/>
+                <w:sz w:val="24"/>
+                <w:szCs w:val="24"/>
+                <w:rtl w:val="0"/>
+              </w:rPr>
+              <w:t xml:space="preserve">N/A at IDS layer</w:t>
+            </w:r>
+          </w:p>
+        </w:tc>
+        <w:tc>
+          <w:tcPr/>
+          <w:p>
+            <w:pPr>
+              <w:rPr>
+                <w:rFonts w:ascii="Calibri" w:cs="Calibri" w:eastAsia="Calibri" w:hAnsi="Calibri"/>
+                <w:sz w:val="24"/>
+                <w:szCs w:val="24"/>
+              </w:rPr>
+            </w:pPr>
+            <w:r>
+              <w:rPr>
+                <w:rFonts w:ascii="Calibri" w:cs="Calibri" w:eastAsia="Calibri" w:hAnsi="Calibri"/>
+                <w:sz w:val="24"/>
+                <w:szCs w:val="24"/>
+                <w:rtl w:val="0"/>
+              </w:rPr>
+              <w:t xml:space="preserve">DB access control</w:t>
+            </w:r>
+          </w:p>
+        </w:tc>
+      </w:tr>
+      <w:tr>
+        <w:trPr>
+          <w:cantSplit w:val="0"/>
+          <w:tblHeader w:val="0"/>
+        </w:trPr>
+        <w:tc>
+          <w:tcPr/>
+          <w:p>
+            <w:pPr>
+              <w:rPr>
+                <w:rFonts w:ascii="Calibri" w:cs="Calibri" w:eastAsia="Calibri" w:hAnsi="Calibri"/>
+                <w:sz w:val="24"/>
+                <w:szCs w:val="24"/>
+              </w:rPr>
+            </w:pPr>
+            <w:r>
+              <w:rPr>
+                <w:rFonts w:ascii="Calibri" w:cs="Calibri" w:eastAsia="Calibri" w:hAnsi="Calibri"/>
+                <w:sz w:val="24"/>
+                <w:szCs w:val="24"/>
+                <w:rtl w:val="0"/>
+              </w:rPr>
+              <w:t xml:space="preserve">Spoofed API</w:t>
+            </w:r>
+          </w:p>
+        </w:tc>
+        <w:tc>
+          <w:tcPr/>
+          <w:p>
+            <w:pPr>
+              <w:rPr>
+                <w:rFonts w:ascii="Calibri" w:cs="Calibri" w:eastAsia="Calibri" w:hAnsi="Calibri"/>
+                <w:sz w:val="24"/>
+                <w:szCs w:val="24"/>
+              </w:rPr>
+            </w:pPr>
+            <w:r>
+              <w:rPr>
+                <w:rFonts w:ascii="Calibri" w:cs="Calibri" w:eastAsia="Calibri" w:hAnsi="Calibri"/>
+                <w:sz w:val="24"/>
+                <w:szCs w:val="24"/>
+                <w:rtl w:val="0"/>
+              </w:rPr>
+              <w:t xml:space="preserve">Fake /api/analyze</w:t>
+            </w:r>
+          </w:p>
+        </w:tc>
+        <w:tc>
+          <w:tcPr/>
+          <w:p>
+            <w:pPr>
+              <w:rPr>
+                <w:rFonts w:ascii="Calibri" w:cs="Calibri" w:eastAsia="Calibri" w:hAnsi="Calibri"/>
+                <w:sz w:val="24"/>
+                <w:szCs w:val="24"/>
+              </w:rPr>
+            </w:pPr>
+            <w:r>
+              <w:rPr>
+                <w:rFonts w:ascii="Calibri" w:cs="Calibri" w:eastAsia="Calibri" w:hAnsi="Calibri"/>
+                <w:sz w:val="24"/>
+                <w:szCs w:val="24"/>
+                <w:rtl w:val="0"/>
+              </w:rPr>
+              <w:t xml:space="preserve">Logged as traffic</w:t>
+            </w:r>
+          </w:p>
+        </w:tc>
+        <w:tc>
+          <w:tcPr/>
+          <w:p>
+            <w:pPr>
+              <w:rPr>
+                <w:rFonts w:ascii="Calibri" w:cs="Calibri" w:eastAsia="Calibri" w:hAnsi="Calibri"/>
+                <w:sz w:val="24"/>
+                <w:szCs w:val="24"/>
+              </w:rPr>
+            </w:pPr>
+            <w:r>
+              <w:rPr>
+                <w:rFonts w:ascii="Calibri" w:cs="Calibri" w:eastAsia="Calibri" w:hAnsi="Calibri"/>
+                <w:sz w:val="24"/>
+                <w:szCs w:val="24"/>
+                <w:rtl w:val="0"/>
+              </w:rPr>
+              <w:t xml:space="preserve">No auth yet</w:t>
+            </w:r>
+          </w:p>
+        </w:tc>
+      </w:tr>
+    </w:tbl>
+    <w:p>
+      <w:pPr>
+        <w:rPr>
+          <w:rFonts w:ascii="Calibri" w:cs="Calibri" w:eastAsia="Calibri" w:hAnsi="Calibri"/>
+        </w:rPr>
+      </w:pPr>
+      <w:r>
+        <w:rPr>
+          <w:rtl w:val="0"/>
+        </w:rPr>
+      </w:r>
+    </w:p>
+    <w:p>
+      <w:pPr>
+        <w:rPr>
+          <w:rFonts w:ascii="Calibri" w:cs="Calibri" w:eastAsia="Calibri" w:hAnsi="Calibri"/>
+          <w:b w:val="1"/>
+          <w:bCs w:val="1"/>
+          <w:color w:val="366091"/>
+          <w:sz w:val="28"/>
+          <w:szCs w:val="28"/>
+        </w:rPr>
+      </w:pPr>
+      <w:r>
+        <w:rPr>
+          <w:rFonts w:ascii="Calibri" w:cs="Calibri" w:eastAsia="Calibri" w:hAnsi="Calibri"/>
+          <w:b w:val="1"/>
+          <w:bCs w:val="1"/>
+          <w:color w:val="366091"/>
+          <w:sz w:val="28"/>
+          <w:szCs w:val="28"/>
+          <w:rtl w:val="0"/>
+        </w:rPr>
+        <w:t xml:space="preserve">14. Risk Assessment</w:t>
+      </w:r>
+    </w:p>
+    <w:p>
+      <w:pPr>
+        <w:rPr>
+          <w:rFonts w:ascii="Calibri" w:cs="Calibri" w:eastAsia="Calibri" w:hAnsi="Calibri"/>
+        </w:rPr>
+      </w:pPr>
+      <w:r>
+        <w:rPr>
+          <w:rFonts w:ascii="Calibri" w:cs="Calibri" w:eastAsia="Calibri" w:hAnsi="Calibri"/>
+          <w:rtl w:val="0"/>
+        </w:rPr>
+        <w:t xml:space="preserve">Table 5 summarizes operational risks. The system detects but does not automatically block traffic.</w:t>
+      </w:r>
+    </w:p>
+    <w:tbl>
+      <w:tblPr>
+        <w:tblStyle w:val="Table12"/>
+        <w:tblW w:w="9360.0" w:type="dxa"/>
+        <w:jc w:val="left"/>
+        <w:tblBorders>
+          <w:top w:color="000000" w:space="0" w:sz="4" w:val="single"/>
+          <w:left w:color="000000" w:space="0" w:sz="4" w:val="single"/>
+          <w:bottom w:color="000000" w:space="0" w:sz="4" w:val="single"/>
+          <w:right w:color="000000" w:space="0" w:sz="4" w:val="single"/>
+          <w:insideH w:color="000000" w:space="0" w:sz="4" w:val="single"/>
+          <w:insideV w:color="000000" w:space="0" w:sz="4" w:val="single"/>
+        </w:tblBorders>
+        <w:tblLayout w:type="fixed"/>
+        <w:tblLook w:val="0400"/>
+      </w:tblPr>
+      <w:tblGrid>
+        <w:gridCol w:w="1872"/>
+        <w:gridCol w:w="1872"/>
+        <w:gridCol w:w="1872"/>
+        <w:gridCol w:w="1872"/>
+        <w:gridCol w:w="1872"/>
+        <w:tblGridChange w:id="0">
+          <w:tblGrid>
+            <w:gridCol w:w="1872"/>
+            <w:gridCol w:w="1872"/>
+            <w:gridCol w:w="1872"/>
+            <w:gridCol w:w="1872"/>
+            <w:gridCol w:w="1872"/>
+          </w:tblGrid>
+        </w:tblGridChange>
+      </w:tblGrid>
+      <w:tr>
+        <w:trPr>
+          <w:cantSplit w:val="0"/>
+          <w:tblHeader w:val="0"/>
+        </w:trPr>
+        <w:tc>
+          <w:tcPr/>
+          <w:p>
+            <w:pPr>
+              <w:rPr>
+                <w:rFonts w:ascii="Calibri" w:cs="Calibri" w:eastAsia="Calibri" w:hAnsi="Calibri"/>
+                <w:sz w:val="24"/>
+                <w:szCs w:val="24"/>
+              </w:rPr>
+            </w:pPr>
+            <w:r>
+              <w:rPr>
+                <w:rFonts w:ascii="Calibri" w:cs="Calibri" w:eastAsia="Calibri" w:hAnsi="Calibri"/>
+                <w:sz w:val="24"/>
+                <w:szCs w:val="24"/>
+                <w:rtl w:val="0"/>
+              </w:rPr>
+              <w:t xml:space="preserve">Risk</w:t>
+            </w:r>
+          </w:p>
+        </w:tc>
+        <w:tc>
+          <w:tcPr/>
+          <w:p>
+            <w:pPr>
+              <w:rPr>
+                <w:rFonts w:ascii="Calibri" w:cs="Calibri" w:eastAsia="Calibri" w:hAnsi="Calibri"/>
+                <w:sz w:val="24"/>
+                <w:szCs w:val="24"/>
+              </w:rPr>
+            </w:pPr>
+            <w:r>
+              <w:rPr>
+                <w:rFonts w:ascii="Calibri" w:cs="Calibri" w:eastAsia="Calibri" w:hAnsi="Calibri"/>
+                <w:sz w:val="24"/>
+                <w:szCs w:val="24"/>
+                <w:rtl w:val="0"/>
+              </w:rPr>
+              <w:t xml:space="preserve">Likelihood</w:t>
+            </w:r>
+          </w:p>
+        </w:tc>
+        <w:tc>
+          <w:tcPr/>
+          <w:p>
+            <w:pPr>
+              <w:rPr>
+                <w:rFonts w:ascii="Calibri" w:cs="Calibri" w:eastAsia="Calibri" w:hAnsi="Calibri"/>
+                <w:sz w:val="24"/>
+                <w:szCs w:val="24"/>
+              </w:rPr>
+            </w:pPr>
+            <w:r>
+              <w:rPr>
+                <w:rFonts w:ascii="Calibri" w:cs="Calibri" w:eastAsia="Calibri" w:hAnsi="Calibri"/>
+                <w:sz w:val="24"/>
+                <w:szCs w:val="24"/>
+                <w:rtl w:val="0"/>
+              </w:rPr>
+              <w:t xml:space="preserve">Impact</w:t>
+            </w:r>
+          </w:p>
+        </w:tc>
+        <w:tc>
+          <w:tcPr/>
+          <w:p>
+            <w:pPr>
+              <w:rPr>
+                <w:rFonts w:ascii="Calibri" w:cs="Calibri" w:eastAsia="Calibri" w:hAnsi="Calibri"/>
+                <w:sz w:val="24"/>
+                <w:szCs w:val="24"/>
+              </w:rPr>
+            </w:pPr>
+            <w:r>
+              <w:rPr>
+                <w:rFonts w:ascii="Calibri" w:cs="Calibri" w:eastAsia="Calibri" w:hAnsi="Calibri"/>
+                <w:sz w:val="24"/>
+                <w:szCs w:val="24"/>
+                <w:rtl w:val="0"/>
+              </w:rPr>
+              <w:t xml:space="preserve">Mitigation</w:t>
+            </w:r>
+          </w:p>
+        </w:tc>
+        <w:tc>
+          <w:tcPr/>
+          <w:p>
+            <w:pPr>
+              <w:rPr>
+                <w:rFonts w:ascii="Calibri" w:cs="Calibri" w:eastAsia="Calibri" w:hAnsi="Calibri"/>
+                <w:sz w:val="24"/>
+                <w:szCs w:val="24"/>
+              </w:rPr>
+            </w:pPr>
+            <w:r>
+              <w:rPr>
+                <w:rFonts w:ascii="Calibri" w:cs="Calibri" w:eastAsia="Calibri" w:hAnsi="Calibri"/>
+                <w:sz w:val="24"/>
+                <w:szCs w:val="24"/>
+                <w:rtl w:val="0"/>
+              </w:rPr>
+              <w:t xml:space="preserve">Residual</w:t>
+            </w:r>
+          </w:p>
+        </w:tc>
+      </w:tr>
+      <w:tr>
+        <w:trPr>
+          <w:cantSplit w:val="0"/>
+          <w:tblHeader w:val="0"/>
+        </w:trPr>
+        <w:tc>
+          <w:tcPr/>
+          <w:p>
+            <w:pPr>
+              <w:rPr>
+                <w:rFonts w:ascii="Calibri" w:cs="Calibri" w:eastAsia="Calibri" w:hAnsi="Calibri"/>
+                <w:sz w:val="24"/>
+                <w:szCs w:val="24"/>
+              </w:rPr>
+            </w:pPr>
+            <w:r>
+              <w:rPr>
+                <w:rFonts w:ascii="Calibri" w:cs="Calibri" w:eastAsia="Calibri" w:hAnsi="Calibri"/>
+                <w:sz w:val="24"/>
+                <w:szCs w:val="24"/>
+                <w:rtl w:val="0"/>
+              </w:rPr>
+              <w:t xml:space="preserve">False negative</w:t>
+            </w:r>
+          </w:p>
+        </w:tc>
+        <w:tc>
+          <w:tcPr/>
+          <w:p>
+            <w:pPr>
+              <w:rPr>
+                <w:rFonts w:ascii="Calibri" w:cs="Calibri" w:eastAsia="Calibri" w:hAnsi="Calibri"/>
+                <w:sz w:val="24"/>
+                <w:szCs w:val="24"/>
+              </w:rPr>
+            </w:pPr>
+            <w:r>
+              <w:rPr>
+                <w:rFonts w:ascii="Calibri" w:cs="Calibri" w:eastAsia="Calibri" w:hAnsi="Calibri"/>
+                <w:sz w:val="24"/>
+                <w:szCs w:val="24"/>
+                <w:rtl w:val="0"/>
+              </w:rPr>
+              <w:t xml:space="preserve">Medium</w:t>
+            </w:r>
+          </w:p>
+        </w:tc>
+        <w:tc>
+          <w:tcPr/>
+          <w:p>
+            <w:pPr>
+              <w:rPr>
+                <w:rFonts w:ascii="Calibri" w:cs="Calibri" w:eastAsia="Calibri" w:hAnsi="Calibri"/>
+                <w:sz w:val="24"/>
+                <w:szCs w:val="24"/>
+              </w:rPr>
+            </w:pPr>
+            <w:r>
+              <w:rPr>
+                <w:rFonts w:ascii="Calibri" w:cs="Calibri" w:eastAsia="Calibri" w:hAnsi="Calibri"/>
+                <w:sz w:val="24"/>
+                <w:szCs w:val="24"/>
+                <w:rtl w:val="0"/>
+              </w:rPr>
+              <w:t xml:space="preserve">High</w:t>
+            </w:r>
+          </w:p>
+        </w:tc>
+        <w:tc>
+          <w:tcPr/>
+          <w:p>
+            <w:pPr>
+              <w:rPr>
+                <w:rFonts w:ascii="Calibri" w:cs="Calibri" w:eastAsia="Calibri" w:hAnsi="Calibri"/>
+                <w:sz w:val="24"/>
+                <w:szCs w:val="24"/>
+              </w:rPr>
+            </w:pPr>
+            <w:r>
+              <w:rPr>
+                <w:rFonts w:ascii="Calibri" w:cs="Calibri" w:eastAsia="Calibri" w:hAnsi="Calibri"/>
+                <w:sz w:val="24"/>
+                <w:szCs w:val="24"/>
+                <w:rtl w:val="0"/>
+              </w:rPr>
+              <w:t xml:space="preserve">Rules + ML; tune thresholds</w:t>
+            </w:r>
+          </w:p>
+        </w:tc>
+        <w:tc>
+          <w:tcPr/>
+          <w:p>
+            <w:pPr>
+              <w:rPr>
+                <w:rFonts w:ascii="Calibri" w:cs="Calibri" w:eastAsia="Calibri" w:hAnsi="Calibri"/>
+                <w:sz w:val="24"/>
+                <w:szCs w:val="24"/>
+              </w:rPr>
+            </w:pPr>
+            <w:r>
+              <w:rPr>
+                <w:rFonts w:ascii="Calibri" w:cs="Calibri" w:eastAsia="Calibri" w:hAnsi="Calibri"/>
+                <w:sz w:val="24"/>
+                <w:szCs w:val="24"/>
+                <w:rtl w:val="0"/>
+              </w:rPr>
+              <w:t xml:space="preserve">Medium</w:t>
+            </w:r>
+          </w:p>
+        </w:tc>
+      </w:tr>
+      <w:tr>
+        <w:trPr>
+          <w:cantSplit w:val="0"/>
+          <w:tblHeader w:val="0"/>
+        </w:trPr>
+        <w:tc>
+          <w:tcPr/>
+          <w:p>
+            <w:pPr>
+              <w:rPr>
+                <w:rFonts w:ascii="Calibri" w:cs="Calibri" w:eastAsia="Calibri" w:hAnsi="Calibri"/>
+                <w:sz w:val="24"/>
+                <w:szCs w:val="24"/>
+              </w:rPr>
+            </w:pPr>
+            <w:r>
+              <w:rPr>
+                <w:rFonts w:ascii="Calibri" w:cs="Calibri" w:eastAsia="Calibri" w:hAnsi="Calibri"/>
+                <w:sz w:val="24"/>
+                <w:szCs w:val="24"/>
+                <w:rtl w:val="0"/>
+              </w:rPr>
+              <w:t xml:space="preserve">False positive</w:t>
+            </w:r>
+          </w:p>
+        </w:tc>
+        <w:tc>
+          <w:tcPr/>
+          <w:p>
+            <w:pPr>
+              <w:rPr>
+                <w:rFonts w:ascii="Calibri" w:cs="Calibri" w:eastAsia="Calibri" w:hAnsi="Calibri"/>
+                <w:sz w:val="24"/>
+                <w:szCs w:val="24"/>
+              </w:rPr>
+            </w:pPr>
+            <w:r>
+              <w:rPr>
+                <w:rFonts w:ascii="Calibri" w:cs="Calibri" w:eastAsia="Calibri" w:hAnsi="Calibri"/>
+                <w:sz w:val="24"/>
+                <w:szCs w:val="24"/>
+                <w:rtl w:val="0"/>
+              </w:rPr>
+              <w:t xml:space="preserve">Medium</w:t>
+            </w:r>
+          </w:p>
+        </w:tc>
+        <w:tc>
+          <w:tcPr/>
+          <w:p>
+            <w:pPr>
+              <w:rPr>
+                <w:rFonts w:ascii="Calibri" w:cs="Calibri" w:eastAsia="Calibri" w:hAnsi="Calibri"/>
+                <w:sz w:val="24"/>
+                <w:szCs w:val="24"/>
+              </w:rPr>
+            </w:pPr>
+            <w:r>
+              <w:rPr>
+                <w:rFonts w:ascii="Calibri" w:cs="Calibri" w:eastAsia="Calibri" w:hAnsi="Calibri"/>
+                <w:sz w:val="24"/>
+                <w:szCs w:val="24"/>
+                <w:rtl w:val="0"/>
+              </w:rPr>
+              <w:t xml:space="preserve">Medium</w:t>
+            </w:r>
+          </w:p>
+        </w:tc>
+        <w:tc>
+          <w:tcPr/>
+          <w:p>
+            <w:pPr>
+              <w:rPr>
+                <w:rFonts w:ascii="Calibri" w:cs="Calibri" w:eastAsia="Calibri" w:hAnsi="Calibri"/>
+                <w:sz w:val="24"/>
+                <w:szCs w:val="24"/>
+              </w:rPr>
+            </w:pPr>
+            <w:r>
+              <w:rPr>
+                <w:rFonts w:ascii="Calibri" w:cs="Calibri" w:eastAsia="Calibri" w:hAnsi="Calibri"/>
+                <w:sz w:val="24"/>
+                <w:szCs w:val="24"/>
+                <w:rtl w:val="0"/>
+              </w:rPr>
+              <w:t xml:space="preserve">96.6% precision; alert cooldown</w:t>
+            </w:r>
+          </w:p>
+        </w:tc>
+        <w:tc>
+          <w:tcPr/>
+          <w:p>
+            <w:pPr>
+              <w:rPr>
+                <w:rFonts w:ascii="Calibri" w:cs="Calibri" w:eastAsia="Calibri" w:hAnsi="Calibri"/>
+                <w:sz w:val="24"/>
+                <w:szCs w:val="24"/>
+              </w:rPr>
+            </w:pPr>
+            <w:r>
+              <w:rPr>
+                <w:rFonts w:ascii="Calibri" w:cs="Calibri" w:eastAsia="Calibri" w:hAnsi="Calibri"/>
+                <w:sz w:val="24"/>
+                <w:szCs w:val="24"/>
+                <w:rtl w:val="0"/>
+              </w:rPr>
+              <w:t xml:space="preserve">Low–Medium</w:t>
+            </w:r>
+          </w:p>
+        </w:tc>
+      </w:tr>
+      <w:tr>
+        <w:trPr>
+          <w:cantSplit w:val="0"/>
+          <w:tblHeader w:val="0"/>
+        </w:trPr>
+        <w:tc>
+          <w:tcPr/>
+          <w:p>
+            <w:pPr>
+              <w:rPr>
+                <w:rFonts w:ascii="Calibri" w:cs="Calibri" w:eastAsia="Calibri" w:hAnsi="Calibri"/>
+                <w:sz w:val="24"/>
+                <w:szCs w:val="24"/>
+              </w:rPr>
+            </w:pPr>
+            <w:r>
+              <w:rPr>
+                <w:rFonts w:ascii="Calibri" w:cs="Calibri" w:eastAsia="Calibri" w:hAnsi="Calibri"/>
+                <w:sz w:val="24"/>
+                <w:szCs w:val="24"/>
+                <w:rtl w:val="0"/>
+              </w:rPr>
+              <w:t xml:space="preserve">ML evasion</w:t>
+            </w:r>
+          </w:p>
+        </w:tc>
+        <w:tc>
+          <w:tcPr/>
+          <w:p>
+            <w:pPr>
+              <w:rPr>
+                <w:rFonts w:ascii="Calibri" w:cs="Calibri" w:eastAsia="Calibri" w:hAnsi="Calibri"/>
+                <w:sz w:val="24"/>
+                <w:szCs w:val="24"/>
+              </w:rPr>
+            </w:pPr>
+            <w:r>
+              <w:rPr>
+                <w:rFonts w:ascii="Calibri" w:cs="Calibri" w:eastAsia="Calibri" w:hAnsi="Calibri"/>
+                <w:sz w:val="24"/>
+                <w:szCs w:val="24"/>
+                <w:rtl w:val="0"/>
+              </w:rPr>
+              <w:t xml:space="preserve">Low</w:t>
+            </w:r>
+          </w:p>
+        </w:tc>
+        <w:tc>
+          <w:tcPr/>
+          <w:p>
+            <w:pPr>
+              <w:rPr>
+                <w:rFonts w:ascii="Calibri" w:cs="Calibri" w:eastAsia="Calibri" w:hAnsi="Calibri"/>
+                <w:sz w:val="24"/>
+                <w:szCs w:val="24"/>
+              </w:rPr>
+            </w:pPr>
+            <w:r>
+              <w:rPr>
+                <w:rFonts w:ascii="Calibri" w:cs="Calibri" w:eastAsia="Calibri" w:hAnsi="Calibri"/>
+                <w:sz w:val="24"/>
+                <w:szCs w:val="24"/>
+                <w:rtl w:val="0"/>
+              </w:rPr>
+              <w:t xml:space="preserve">High</w:t>
+            </w:r>
+          </w:p>
+        </w:tc>
+        <w:tc>
+          <w:tcPr/>
+          <w:p>
+            <w:pPr>
+              <w:rPr>
+                <w:rFonts w:ascii="Calibri" w:cs="Calibri" w:eastAsia="Calibri" w:hAnsi="Calibri"/>
+                <w:sz w:val="24"/>
+                <w:szCs w:val="24"/>
+              </w:rPr>
+            </w:pPr>
+            <w:r>
+              <w:rPr>
+                <w:rFonts w:ascii="Calibri" w:cs="Calibri" w:eastAsia="Calibri" w:hAnsi="Calibri"/>
+                <w:sz w:val="24"/>
+                <w:szCs w:val="24"/>
+                <w:rtl w:val="0"/>
+              </w:rPr>
+              <w:t xml:space="preserve">Rule layer; retrain</w:t>
+            </w:r>
+          </w:p>
+        </w:tc>
+        <w:tc>
+          <w:tcPr/>
+          <w:p>
+            <w:pPr>
+              <w:rPr>
+                <w:rFonts w:ascii="Calibri" w:cs="Calibri" w:eastAsia="Calibri" w:hAnsi="Calibri"/>
+                <w:sz w:val="24"/>
+                <w:szCs w:val="24"/>
+              </w:rPr>
+            </w:pPr>
+            <w:r>
+              <w:rPr>
+                <w:rFonts w:ascii="Calibri" w:cs="Calibri" w:eastAsia="Calibri" w:hAnsi="Calibri"/>
+                <w:sz w:val="24"/>
+                <w:szCs w:val="24"/>
+                <w:rtl w:val="0"/>
+              </w:rPr>
+              <w:t xml:space="preserve">Medium</w:t>
+            </w:r>
+          </w:p>
+        </w:tc>
+      </w:tr>
+      <w:tr>
+        <w:trPr>
+          <w:cantSplit w:val="0"/>
+          <w:tblHeader w:val="0"/>
+        </w:trPr>
+        <w:tc>
+          <w:tcPr/>
+          <w:p>
+            <w:pPr>
+              <w:rPr>
+                <w:rFonts w:ascii="Calibri" w:cs="Calibri" w:eastAsia="Calibri" w:hAnsi="Calibri"/>
+                <w:sz w:val="24"/>
+                <w:szCs w:val="24"/>
+              </w:rPr>
+            </w:pPr>
+            <w:r>
+              <w:rPr>
+                <w:rFonts w:ascii="Calibri" w:cs="Calibri" w:eastAsia="Calibri" w:hAnsi="Calibri"/>
+                <w:sz w:val="24"/>
+                <w:szCs w:val="24"/>
+                <w:rtl w:val="0"/>
+              </w:rPr>
+              <w:t xml:space="preserve">Sniffer abuse</w:t>
+            </w:r>
+          </w:p>
+        </w:tc>
+        <w:tc>
+          <w:tcPr/>
+          <w:p>
+            <w:pPr>
+              <w:rPr>
+                <w:rFonts w:ascii="Calibri" w:cs="Calibri" w:eastAsia="Calibri" w:hAnsi="Calibri"/>
+                <w:sz w:val="24"/>
+                <w:szCs w:val="24"/>
+              </w:rPr>
+            </w:pPr>
+            <w:r>
+              <w:rPr>
+                <w:rFonts w:ascii="Calibri" w:cs="Calibri" w:eastAsia="Calibri" w:hAnsi="Calibri"/>
+                <w:sz w:val="24"/>
+                <w:szCs w:val="24"/>
+                <w:rtl w:val="0"/>
+              </w:rPr>
+              <w:t xml:space="preserve">Low</w:t>
+            </w:r>
+          </w:p>
+        </w:tc>
+        <w:tc>
+          <w:tcPr/>
+          <w:p>
+            <w:pPr>
+              <w:rPr>
+                <w:rFonts w:ascii="Calibri" w:cs="Calibri" w:eastAsia="Calibri" w:hAnsi="Calibri"/>
+                <w:sz w:val="24"/>
+                <w:szCs w:val="24"/>
+              </w:rPr>
+            </w:pPr>
+            <w:r>
+              <w:rPr>
+                <w:rFonts w:ascii="Calibri" w:cs="Calibri" w:eastAsia="Calibri" w:hAnsi="Calibri"/>
+                <w:sz w:val="24"/>
+                <w:szCs w:val="24"/>
+                <w:rtl w:val="0"/>
+              </w:rPr>
+              <w:t xml:space="preserve">High</w:t>
+            </w:r>
+          </w:p>
+        </w:tc>
+        <w:tc>
+          <w:tcPr/>
+          <w:p>
+            <w:pPr>
+              <w:rPr>
+                <w:rFonts w:ascii="Calibri" w:cs="Calibri" w:eastAsia="Calibri" w:hAnsi="Calibri"/>
+                <w:sz w:val="24"/>
+                <w:szCs w:val="24"/>
+              </w:rPr>
+            </w:pPr>
+            <w:r>
+              <w:rPr>
+                <w:rFonts w:ascii="Calibri" w:cs="Calibri" w:eastAsia="Calibri" w:hAnsi="Calibri"/>
+                <w:sz w:val="24"/>
+                <w:szCs w:val="24"/>
+                <w:rtl w:val="0"/>
+              </w:rPr>
+              <w:t xml:space="preserve">Lab-only; limit sudo</w:t>
+            </w:r>
+          </w:p>
+        </w:tc>
+        <w:tc>
+          <w:tcPr/>
+          <w:p>
+            <w:pPr>
+              <w:rPr>
+                <w:rFonts w:ascii="Calibri" w:cs="Calibri" w:eastAsia="Calibri" w:hAnsi="Calibri"/>
+                <w:sz w:val="24"/>
+                <w:szCs w:val="24"/>
+              </w:rPr>
+            </w:pPr>
+            <w:r>
+              <w:rPr>
+                <w:rFonts w:ascii="Calibri" w:cs="Calibri" w:eastAsia="Calibri" w:hAnsi="Calibri"/>
+                <w:sz w:val="24"/>
+                <w:szCs w:val="24"/>
+                <w:rtl w:val="0"/>
+              </w:rPr>
+              <w:t xml:space="preserve">Low</w:t>
+            </w:r>
+          </w:p>
+        </w:tc>
+      </w:tr>
+      <w:tr>
+        <w:trPr>
+          <w:cantSplit w:val="0"/>
+          <w:tblHeader w:val="0"/>
+        </w:trPr>
+        <w:tc>
+          <w:tcPr/>
+          <w:p>
+            <w:pPr>
+              <w:rPr>
+                <w:rFonts w:ascii="Calibri" w:cs="Calibri" w:eastAsia="Calibri" w:hAnsi="Calibri"/>
+                <w:sz w:val="24"/>
+                <w:szCs w:val="24"/>
+              </w:rPr>
+            </w:pPr>
+            <w:r>
+              <w:rPr>
+                <w:rFonts w:ascii="Calibri" w:cs="Calibri" w:eastAsia="Calibri" w:hAnsi="Calibri"/>
+                <w:sz w:val="24"/>
+                <w:szCs w:val="24"/>
+                <w:rtl w:val="0"/>
+              </w:rPr>
+              <w:t xml:space="preserve">Unauthorized API</w:t>
+            </w:r>
+          </w:p>
+        </w:tc>
+        <w:tc>
+          <w:tcPr/>
+          <w:p>
+            <w:pPr>
+              <w:rPr>
+                <w:rFonts w:ascii="Calibri" w:cs="Calibri" w:eastAsia="Calibri" w:hAnsi="Calibri"/>
+                <w:sz w:val="24"/>
+                <w:szCs w:val="24"/>
+              </w:rPr>
+            </w:pPr>
+            <w:r>
+              <w:rPr>
+                <w:rFonts w:ascii="Calibri" w:cs="Calibri" w:eastAsia="Calibri" w:hAnsi="Calibri"/>
+                <w:sz w:val="24"/>
+                <w:szCs w:val="24"/>
+                <w:rtl w:val="0"/>
+              </w:rPr>
+              <w:t xml:space="preserve">Medium</w:t>
+            </w:r>
+          </w:p>
+        </w:tc>
+        <w:tc>
+          <w:tcPr/>
+          <w:p>
+            <w:pPr>
+              <w:rPr>
+                <w:rFonts w:ascii="Calibri" w:cs="Calibri" w:eastAsia="Calibri" w:hAnsi="Calibri"/>
+                <w:sz w:val="24"/>
+                <w:szCs w:val="24"/>
+              </w:rPr>
+            </w:pPr>
+            <w:r>
+              <w:rPr>
+                <w:rFonts w:ascii="Calibri" w:cs="Calibri" w:eastAsia="Calibri" w:hAnsi="Calibri"/>
+                <w:sz w:val="24"/>
+                <w:szCs w:val="24"/>
+                <w:rtl w:val="0"/>
+              </w:rPr>
+              <w:t xml:space="preserve">Medium</w:t>
+            </w:r>
+          </w:p>
+        </w:tc>
+        <w:tc>
+          <w:tcPr/>
+          <w:p>
+            <w:pPr>
+              <w:rPr>
+                <w:rFonts w:ascii="Calibri" w:cs="Calibri" w:eastAsia="Calibri" w:hAnsi="Calibri"/>
+                <w:sz w:val="24"/>
+                <w:szCs w:val="24"/>
+              </w:rPr>
+            </w:pPr>
+            <w:r>
+              <w:rPr>
+                <w:rFonts w:ascii="Calibri" w:cs="Calibri" w:eastAsia="Calibri" w:hAnsi="Calibri"/>
+                <w:sz w:val="24"/>
+                <w:szCs w:val="24"/>
+                <w:rtl w:val="0"/>
+              </w:rPr>
+              <w:t xml:space="preserve">Firewall/VPN</w:t>
+            </w:r>
+          </w:p>
+        </w:tc>
+        <w:tc>
+          <w:tcPr/>
+          <w:p>
+            <w:pPr>
+              <w:rPr>
+                <w:rFonts w:ascii="Calibri" w:cs="Calibri" w:eastAsia="Calibri" w:hAnsi="Calibri"/>
+                <w:sz w:val="24"/>
+                <w:szCs w:val="24"/>
+              </w:rPr>
+            </w:pPr>
+            <w:r>
+              <w:rPr>
+                <w:rFonts w:ascii="Calibri" w:cs="Calibri" w:eastAsia="Calibri" w:hAnsi="Calibri"/>
+                <w:sz w:val="24"/>
+                <w:szCs w:val="24"/>
+                <w:rtl w:val="0"/>
+              </w:rPr>
+              <w:t xml:space="preserve">Medium</w:t>
+            </w:r>
+          </w:p>
+        </w:tc>
+      </w:tr>
+      <w:tr>
+        <w:trPr>
+          <w:cantSplit w:val="0"/>
+          <w:tblHeader w:val="0"/>
+        </w:trPr>
+        <w:tc>
+          <w:tcPr/>
+          <w:p>
+            <w:pPr>
+              <w:rPr>
+                <w:rFonts w:ascii="Calibri" w:cs="Calibri" w:eastAsia="Calibri" w:hAnsi="Calibri"/>
+                <w:sz w:val="24"/>
+                <w:szCs w:val="24"/>
+              </w:rPr>
+            </w:pPr>
+            <w:r>
+              <w:rPr>
+                <w:rFonts w:ascii="Calibri" w:cs="Calibri" w:eastAsia="Calibri" w:hAnsi="Calibri"/>
+                <w:sz w:val="24"/>
+                <w:szCs w:val="24"/>
+                <w:rtl w:val="0"/>
+              </w:rPr>
+              <w:t xml:space="preserve">DB credential leak</w:t>
+            </w:r>
+          </w:p>
+        </w:tc>
+        <w:tc>
+          <w:tcPr/>
+          <w:p>
+            <w:pPr>
+              <w:rPr>
+                <w:rFonts w:ascii="Calibri" w:cs="Calibri" w:eastAsia="Calibri" w:hAnsi="Calibri"/>
+                <w:sz w:val="24"/>
+                <w:szCs w:val="24"/>
+              </w:rPr>
+            </w:pPr>
+            <w:r>
+              <w:rPr>
+                <w:rFonts w:ascii="Calibri" w:cs="Calibri" w:eastAsia="Calibri" w:hAnsi="Calibri"/>
+                <w:sz w:val="24"/>
+                <w:szCs w:val="24"/>
+                <w:rtl w:val="0"/>
+              </w:rPr>
+              <w:t xml:space="preserve">Low</w:t>
+            </w:r>
+          </w:p>
+        </w:tc>
+        <w:tc>
+          <w:tcPr/>
+          <w:p>
+            <w:pPr>
+              <w:rPr>
+                <w:rFonts w:ascii="Calibri" w:cs="Calibri" w:eastAsia="Calibri" w:hAnsi="Calibri"/>
+                <w:sz w:val="24"/>
+                <w:szCs w:val="24"/>
+              </w:rPr>
+            </w:pPr>
+            <w:r>
+              <w:rPr>
+                <w:rFonts w:ascii="Calibri" w:cs="Calibri" w:eastAsia="Calibri" w:hAnsi="Calibri"/>
+                <w:sz w:val="24"/>
+                <w:szCs w:val="24"/>
+                <w:rtl w:val="0"/>
+              </w:rPr>
+              <w:t xml:space="preserve">High</w:t>
+            </w:r>
+          </w:p>
+        </w:tc>
+        <w:tc>
+          <w:tcPr/>
+          <w:p>
+            <w:pPr>
+              <w:rPr>
+                <w:rFonts w:ascii="Calibri" w:cs="Calibri" w:eastAsia="Calibri" w:hAnsi="Calibri"/>
+                <w:sz w:val="24"/>
+                <w:szCs w:val="24"/>
+              </w:rPr>
+            </w:pPr>
+            <w:r>
+              <w:rPr>
+                <w:rFonts w:ascii="Calibri" w:cs="Calibri" w:eastAsia="Calibri" w:hAnsi="Calibri"/>
+                <w:sz w:val="24"/>
+                <w:szCs w:val="24"/>
+                <w:rtl w:val="0"/>
+              </w:rPr>
+              <w:t xml:space="preserve">.env not in Git</w:t>
+            </w:r>
+          </w:p>
+        </w:tc>
+        <w:tc>
+          <w:tcPr/>
+          <w:p>
+            <w:pPr>
+              <w:rPr>
+                <w:rFonts w:ascii="Calibri" w:cs="Calibri" w:eastAsia="Calibri" w:hAnsi="Calibri"/>
+                <w:sz w:val="24"/>
+                <w:szCs w:val="24"/>
+              </w:rPr>
+            </w:pPr>
+            <w:r>
+              <w:rPr>
+                <w:rFonts w:ascii="Calibri" w:cs="Calibri" w:eastAsia="Calibri" w:hAnsi="Calibri"/>
+                <w:sz w:val="24"/>
+                <w:szCs w:val="24"/>
+                <w:rtl w:val="0"/>
+              </w:rPr>
+              <w:t xml:space="preserve">Low</w:t>
+            </w:r>
+          </w:p>
+        </w:tc>
+      </w:tr>
+      <w:tr>
+        <w:trPr>
+          <w:cantSplit w:val="0"/>
+          <w:tblHeader w:val="0"/>
+        </w:trPr>
+        <w:tc>
+          <w:tcPr/>
+          <w:p>
+            <w:pPr>
+              <w:rPr>
+                <w:rFonts w:ascii="Calibri" w:cs="Calibri" w:eastAsia="Calibri" w:hAnsi="Calibri"/>
+                <w:sz w:val="24"/>
+                <w:szCs w:val="24"/>
+              </w:rPr>
+            </w:pPr>
+            <w:r>
+              <w:rPr>
+                <w:rFonts w:ascii="Calibri" w:cs="Calibri" w:eastAsia="Calibri" w:hAnsi="Calibri"/>
+                <w:sz w:val="24"/>
+                <w:szCs w:val="24"/>
+                <w:rtl w:val="0"/>
+              </w:rPr>
+              <w:t xml:space="preserve">No auto-blocking</w:t>
+            </w:r>
+          </w:p>
+        </w:tc>
+        <w:tc>
+          <w:tcPr/>
+          <w:p>
+            <w:pPr>
+              <w:rPr>
+                <w:rFonts w:ascii="Calibri" w:cs="Calibri" w:eastAsia="Calibri" w:hAnsi="Calibri"/>
+                <w:sz w:val="24"/>
+                <w:szCs w:val="24"/>
+              </w:rPr>
+            </w:pPr>
+            <w:r>
+              <w:rPr>
+                <w:rFonts w:ascii="Calibri" w:cs="Calibri" w:eastAsia="Calibri" w:hAnsi="Calibri"/>
+                <w:sz w:val="24"/>
+                <w:szCs w:val="24"/>
+                <w:rtl w:val="0"/>
+              </w:rPr>
+              <w:t xml:space="preserve">High</w:t>
+            </w:r>
+          </w:p>
+        </w:tc>
+        <w:tc>
+          <w:tcPr/>
+          <w:p>
+            <w:pPr>
+              <w:rPr>
+                <w:rFonts w:ascii="Calibri" w:cs="Calibri" w:eastAsia="Calibri" w:hAnsi="Calibri"/>
+                <w:sz w:val="24"/>
+                <w:szCs w:val="24"/>
+              </w:rPr>
+            </w:pPr>
+            <w:r>
+              <w:rPr>
+                <w:rFonts w:ascii="Calibri" w:cs="Calibri" w:eastAsia="Calibri" w:hAnsi="Calibri"/>
+                <w:sz w:val="24"/>
+                <w:szCs w:val="24"/>
+                <w:rtl w:val="0"/>
+              </w:rPr>
+              <w:t xml:space="preserve">Medium</w:t>
+            </w:r>
+          </w:p>
+        </w:tc>
+        <w:tc>
+          <w:tcPr/>
+          <w:p>
+            <w:pPr>
+              <w:rPr>
+                <w:rFonts w:ascii="Calibri" w:cs="Calibri" w:eastAsia="Calibri" w:hAnsi="Calibri"/>
+                <w:sz w:val="24"/>
+                <w:szCs w:val="24"/>
+              </w:rPr>
+            </w:pPr>
+            <w:r>
+              <w:rPr>
+                <w:rFonts w:ascii="Calibri" w:cs="Calibri" w:eastAsia="Calibri" w:hAnsi="Calibri"/>
+                <w:sz w:val="24"/>
+                <w:szCs w:val="24"/>
+                <w:rtl w:val="0"/>
+              </w:rPr>
+              <w:t xml:space="preserve">Manual response</w:t>
+            </w:r>
+          </w:p>
+        </w:tc>
+        <w:tc>
+          <w:tcPr/>
+          <w:p>
+            <w:pPr>
+              <w:rPr>
+                <w:rFonts w:ascii="Calibri" w:cs="Calibri" w:eastAsia="Calibri" w:hAnsi="Calibri"/>
+                <w:sz w:val="24"/>
+                <w:szCs w:val="24"/>
+              </w:rPr>
+            </w:pPr>
+            <w:r>
+              <w:rPr>
+                <w:rFonts w:ascii="Calibri" w:cs="Calibri" w:eastAsia="Calibri" w:hAnsi="Calibri"/>
+                <w:sz w:val="24"/>
+                <w:szCs w:val="24"/>
+                <w:rtl w:val="0"/>
+              </w:rPr>
+              <w:t xml:space="preserve">High</w:t>
+            </w:r>
+          </w:p>
+        </w:tc>
+      </w:tr>
+      <w:tr>
+        <w:trPr>
+          <w:cantSplit w:val="0"/>
+          <w:tblHeader w:val="0"/>
+        </w:trPr>
+        <w:tc>
+          <w:tcPr/>
+          <w:p>
+            <w:pPr>
+              <w:rPr>
+                <w:rFonts w:ascii="Calibri" w:cs="Calibri" w:eastAsia="Calibri" w:hAnsi="Calibri"/>
+                <w:sz w:val="24"/>
+                <w:szCs w:val="24"/>
+              </w:rPr>
+            </w:pPr>
+            <w:r>
+              <w:rPr>
+                <w:rFonts w:ascii="Calibri" w:cs="Calibri" w:eastAsia="Calibri" w:hAnsi="Calibri"/>
+                <w:sz w:val="24"/>
+                <w:szCs w:val="24"/>
+                <w:rtl w:val="0"/>
+              </w:rPr>
+              <w:t xml:space="preserve">Benchmark vs live gap</w:t>
+            </w:r>
+          </w:p>
+        </w:tc>
+        <w:tc>
+          <w:tcPr/>
+          <w:p>
+            <w:pPr>
+              <w:rPr>
+                <w:rFonts w:ascii="Calibri" w:cs="Calibri" w:eastAsia="Calibri" w:hAnsi="Calibri"/>
+                <w:sz w:val="24"/>
+                <w:szCs w:val="24"/>
+              </w:rPr>
+            </w:pPr>
+            <w:r>
+              <w:rPr>
+                <w:rFonts w:ascii="Calibri" w:cs="Calibri" w:eastAsia="Calibri" w:hAnsi="Calibri"/>
+                <w:sz w:val="24"/>
+                <w:szCs w:val="24"/>
+                <w:rtl w:val="0"/>
+              </w:rPr>
+              <w:t xml:space="preserve">High</w:t>
+            </w:r>
+          </w:p>
+        </w:tc>
+        <w:tc>
+          <w:tcPr/>
+          <w:p>
+            <w:pPr>
+              <w:rPr>
+                <w:rFonts w:ascii="Calibri" w:cs="Calibri" w:eastAsia="Calibri" w:hAnsi="Calibri"/>
+                <w:sz w:val="24"/>
+                <w:szCs w:val="24"/>
+              </w:rPr>
+            </w:pPr>
+            <w:r>
+              <w:rPr>
+                <w:rFonts w:ascii="Calibri" w:cs="Calibri" w:eastAsia="Calibri" w:hAnsi="Calibri"/>
+                <w:sz w:val="24"/>
+                <w:szCs w:val="24"/>
+                <w:rtl w:val="0"/>
+              </w:rPr>
+              <w:t xml:space="preserve">Medium</w:t>
+            </w:r>
+          </w:p>
+        </w:tc>
+        <w:tc>
+          <w:tcPr/>
+          <w:p>
+            <w:pPr>
+              <w:rPr>
+                <w:rFonts w:ascii="Calibri" w:cs="Calibri" w:eastAsia="Calibri" w:hAnsi="Calibri"/>
+                <w:sz w:val="24"/>
+                <w:szCs w:val="24"/>
+              </w:rPr>
+            </w:pPr>
+            <w:r>
+              <w:rPr>
+                <w:rFonts w:ascii="Calibri" w:cs="Calibri" w:eastAsia="Calibri" w:hAnsi="Calibri"/>
+                <w:sz w:val="24"/>
+                <w:szCs w:val="24"/>
+                <w:rtl w:val="0"/>
+              </w:rPr>
+              <w:t xml:space="preserve">KDDTest+ + live demos</w:t>
+            </w:r>
+          </w:p>
+        </w:tc>
+        <w:tc>
+          <w:tcPr/>
+          <w:p>
+            <w:pPr>
+              <w:rPr>
+                <w:rFonts w:ascii="Calibri" w:cs="Calibri" w:eastAsia="Calibri" w:hAnsi="Calibri"/>
+                <w:sz w:val="24"/>
+                <w:szCs w:val="24"/>
+              </w:rPr>
+            </w:pPr>
+            <w:r>
+              <w:rPr>
+                <w:rFonts w:ascii="Calibri" w:cs="Calibri" w:eastAsia="Calibri" w:hAnsi="Calibri"/>
+                <w:sz w:val="24"/>
+                <w:szCs w:val="24"/>
+                <w:rtl w:val="0"/>
+              </w:rPr>
+              <w:t xml:space="preserve">Medium</w:t>
+            </w:r>
+          </w:p>
+        </w:tc>
+      </w:tr>
+    </w:tbl>
+    <w:p>
+      <w:pPr>
+        <w:rPr>
+          <w:rFonts w:ascii="Calibri" w:cs="Calibri" w:eastAsia="Calibri" w:hAnsi="Calibri"/>
+        </w:rPr>
+      </w:pPr>
+      <w:r>
+        <w:rPr>
+          <w:rtl w:val="0"/>
+        </w:rPr>
+      </w:r>
+    </w:p>
+    <w:p>
+      <w:pPr>
+        <w:rPr>
+          <w:rFonts w:ascii="Calibri" w:cs="Calibri" w:eastAsia="Calibri" w:hAnsi="Calibri"/>
+          <w:b w:val="1"/>
+          <w:bCs w:val="1"/>
+          <w:color w:val="366091"/>
+          <w:sz w:val="28"/>
+          <w:szCs w:val="28"/>
+        </w:rPr>
+      </w:pPr>
+      <w:r>
+        <w:rPr>
+          <w:rFonts w:ascii="Calibri" w:cs="Calibri" w:eastAsia="Calibri" w:hAnsi="Calibri"/>
+          <w:b w:val="1"/>
+          <w:bCs w:val="1"/>
+          <w:color w:val="366091"/>
+          <w:sz w:val="28"/>
+          <w:szCs w:val="28"/>
+          <w:rtl w:val="0"/>
+        </w:rPr>
+        <w:t xml:space="preserve">Appendix A: System Diagrams</w:t>
+      </w:r>
+    </w:p>
+    <w:p>
+      <w:pPr>
+        <w:rPr>
+          <w:rFonts w:ascii="Calibri" w:cs="Calibri" w:eastAsia="Calibri" w:hAnsi="Calibri"/>
+        </w:rPr>
+      </w:pPr>
+      <w:r>
+        <w:rPr>
+          <w:rFonts w:ascii="Calibri" w:cs="Calibri" w:eastAsia="Calibri" w:hAnsi="Calibri"/>
+          <w:rtl w:val="0"/>
+        </w:rPr>
+        <w:t xml:space="preserve">Figure 1. System architecture — sniffer/API, Express, FastAPI ML, PostgreSQL, React dashboard.</w:t>
+      </w:r>
+    </w:p>
+    <w:p>
+      <w:pPr>
+        <w:rPr>
+          <w:rFonts w:ascii="Calibri" w:cs="Calibri" w:eastAsia="Calibri" w:hAnsi="Calibri"/>
+        </w:rPr>
+      </w:pPr>
+      <w:r>
+        <w:rPr>
+          <w:rFonts w:ascii="Calibri" w:cs="Calibri" w:eastAsia="Calibri" w:hAnsi="Calibri"/>
+        </w:rPr>
+        <w:drawing>
+          <wp:inline distB="0" distT="0" distL="114300" distR="114300">
+            <wp:extent cx="5669280" cy="3779520"/>
+            <wp:effectExtent b="0" l="0" r="0" t="0"/>
+            <wp:docPr id="1" name="image1.png"/>
+            <a:graphic>
+              <a:graphicData uri="http://schemas.openxmlformats.org/drawingml/2006/picture">
+                <pic:pic>
+                  <pic:nvPicPr>
+                    <pic:cNvPr id="0" name="image1.png"/>
+                    <pic:cNvPicPr preferRelativeResize="0"/>
+                  </pic:nvPicPr>
+                  <pic:blipFill>
+                    <a:blip r:embed="rId6"/>
+                    <a:srcRect b="0" l="0" r="0" t="0"/>
+                    <a:stretch>
+                      <a:fillRect/>
+                    </a:stretch>
+                  </pic:blipFill>
+                  <pic:spPr>
+                    <a:xfrm>
+                      <a:off x="0" y="0"/>
+                      <a:ext cx="5669280" cy="3779520"/>
+                    </a:xfrm>
+                    <a:prstGeom prst="rect"/>
+                    <a:ln/>
+                  </pic:spPr>
+                </pic:pic>
+              </a:graphicData>
+            </a:graphic>
+          </wp:inline>
+        </w:drawing>
+      </w:r>
+      <w:r>
+        <w:rPr>
+          <w:rtl w:val="0"/>
+        </w:rPr>
+      </w:r>
+    </w:p>
+    <w:p>
+      <w:pPr>
+        <w:rPr>
+          <w:rFonts w:ascii="Calibri" w:cs="Calibri" w:eastAsia="Calibri" w:hAnsi="Calibri"/>
+        </w:rPr>
+      </w:pPr>
+      <w:r>
+        <w:rPr>
+          <w:rtl w:val="0"/>
+        </w:rPr>
+      </w:r>
+    </w:p>
+    <w:p>
+      <w:pPr>
+        <w:rPr>
+          <w:rFonts w:ascii="Calibri" w:cs="Calibri" w:eastAsia="Calibri" w:hAnsi="Calibri"/>
+        </w:rPr>
+      </w:pPr>
+      <w:r>
+        <w:rPr>
+          <w:rtl w:val="0"/>
+        </w:rPr>
+      </w:r>
+    </w:p>
+    <w:p>
+      <w:pPr>
+        <w:rPr>
+          <w:rFonts w:ascii="Calibri" w:cs="Calibri" w:eastAsia="Calibri" w:hAnsi="Calibri"/>
+        </w:rPr>
+      </w:pPr>
+      <w:r>
+        <w:rPr>
+          <w:rtl w:val="0"/>
+        </w:rPr>
+      </w:r>
+    </w:p>
+    <w:p>
+      <w:pPr>
+        <w:rPr>
+          <w:rFonts w:ascii="Calibri" w:cs="Calibri" w:eastAsia="Calibri" w:hAnsi="Calibri"/>
+        </w:rPr>
+      </w:pPr>
+      <w:r>
+        <w:rPr>
+          <w:rtl w:val="0"/>
+        </w:rPr>
+      </w:r>
+    </w:p>
+    <w:p>
+      <w:pPr>
+        <w:rPr>
+          <w:rFonts w:ascii="Calibri" w:cs="Calibri" w:eastAsia="Calibri" w:hAnsi="Calibri"/>
+        </w:rPr>
+      </w:pPr>
+      <w:r>
+        <w:rPr>
+          <w:rtl w:val="0"/>
+        </w:rPr>
+      </w:r>
+    </w:p>
+    <w:p>
+      <w:pPr>
+        <w:rPr>
+          <w:rFonts w:ascii="Calibri" w:cs="Calibri" w:eastAsia="Calibri" w:hAnsi="Calibri"/>
+        </w:rPr>
+      </w:pPr>
+      <w:r>
+        <w:rPr>
+          <w:rFonts w:ascii="Calibri" w:cs="Calibri" w:eastAsia="Calibri" w:hAnsi="Calibri"/>
+          <w:rtl w:val="0"/>
+        </w:rPr>
+        <w:t xml:space="preserve">Figure 2. Detection flow — rules before ML; alerts after three consecutive suspicious windows.</w:t>
+      </w:r>
+    </w:p>
+    <w:p>
+      <w:pPr>
+        <w:rPr>
+          <w:rFonts w:ascii="Calibri" w:cs="Calibri" w:eastAsia="Calibri" w:hAnsi="Calibri"/>
+        </w:rPr>
+      </w:pPr>
+      <w:r>
+        <w:rPr>
+          <w:rFonts w:ascii="Calibri" w:cs="Calibri" w:eastAsia="Calibri" w:hAnsi="Calibri"/>
+        </w:rPr>
+        <w:drawing>
+          <wp:inline distB="0" distT="0" distL="114300" distR="114300">
+            <wp:extent cx="5669280" cy="3779520"/>
+            <wp:effectExtent b="0" l="0" r="0" t="0"/>
+            <wp:docPr id="2" name="image2.png"/>
+            <a:graphic>
+              <a:graphicData uri="http://schemas.openxmlformats.org/drawingml/2006/picture">
+                <pic:pic>
+                  <pic:nvPicPr>
+                    <pic:cNvPr id="0" name="image2.png"/>
+                    <pic:cNvPicPr preferRelativeResize="0"/>
+                  </pic:nvPicPr>
+                  <pic:blipFill>
+                    <a:blip r:embed="rId7"/>
+                    <a:srcRect b="0" l="0" r="0" t="0"/>
+                    <a:stretch>
+                      <a:fillRect/>
+                    </a:stretch>
+                  </pic:blipFill>
+                  <pic:spPr>
+                    <a:xfrm>
+                      <a:off x="0" y="0"/>
+                      <a:ext cx="5669280" cy="3779520"/>
+                    </a:xfrm>
+                    <a:prstGeom prst="rect"/>
+                    <a:ln/>
+                  </pic:spPr>
+                </pic:pic>
+              </a:graphicData>
+            </a:graphic>
+          </wp:inline>
+        </w:drawing>
+      </w:r>
+      <w:r>
+        <w:rPr>
+          <w:rtl w:val="0"/>
+        </w:rPr>
+      </w:r>
+    </w:p>
+    <w:p>
+      <w:pPr>
+        <w:rPr>
+          <w:rFonts w:ascii="Calibri" w:cs="Calibri" w:eastAsia="Calibri" w:hAnsi="Calibri"/>
+        </w:rPr>
+      </w:pPr>
+      <w:r>
+        <w:rPr>
+          <w:rtl w:val="0"/>
+        </w:rPr>
+      </w:r>
+    </w:p>
+    <w:p>
+      <w:pPr>
+        <w:rPr>
+          <w:rFonts w:ascii="Calibri" w:cs="Calibri" w:eastAsia="Calibri" w:hAnsi="Calibri"/>
+          <w:b w:val="1"/>
+          <w:bCs w:val="1"/>
+          <w:color w:val="366091"/>
+          <w:sz w:val="28"/>
+          <w:szCs w:val="28"/>
+        </w:rPr>
+      </w:pPr>
+      <w:r>
+        <w:rPr>
+          <w:rtl w:val="0"/>
+        </w:rPr>
+      </w:r>
+    </w:p>
+    <w:p>
+      <w:pPr>
+        <w:rPr>
+          <w:rFonts w:ascii="Calibri" w:cs="Calibri" w:eastAsia="Calibri" w:hAnsi="Calibri"/>
+          <w:b w:val="1"/>
+          <w:bCs w:val="1"/>
+          <w:color w:val="366091"/>
+          <w:sz w:val="28"/>
+          <w:szCs w:val="28"/>
+        </w:rPr>
+      </w:pPr>
+      <w:r>
+        <w:rPr>
+          <w:rtl w:val="0"/>
+        </w:rPr>
+      </w:r>
+    </w:p>
+    <w:p>
+      <w:pPr>
+        <w:rPr>
+          <w:rFonts w:ascii="Calibri" w:cs="Calibri" w:eastAsia="Calibri" w:hAnsi="Calibri"/>
+          <w:b w:val="1"/>
+          <w:bCs w:val="1"/>
+          <w:color w:val="366091"/>
+          <w:sz w:val="28"/>
+          <w:szCs w:val="28"/>
+        </w:rPr>
+      </w:pPr>
+      <w:r>
+        <w:rPr>
+          <w:rtl w:val="0"/>
+        </w:rPr>
+      </w:r>
+    </w:p>
+    <w:p>
+      <w:pPr>
+        <w:rPr>
+          <w:rFonts w:ascii="Calibri" w:cs="Calibri" w:eastAsia="Calibri" w:hAnsi="Calibri"/>
+          <w:b w:val="1"/>
+          <w:bCs w:val="1"/>
+          <w:color w:val="366091"/>
+          <w:sz w:val="28"/>
+          <w:szCs w:val="28"/>
+        </w:rPr>
+      </w:pPr>
+      <w:r>
+        <w:rPr>
+          <w:rtl w:val="0"/>
+        </w:rPr>
+      </w:r>
+    </w:p>
+    <w:p>
+      <w:pPr>
+        <w:rPr>
+          <w:rFonts w:ascii="Calibri" w:cs="Calibri" w:eastAsia="Calibri" w:hAnsi="Calibri"/>
+          <w:b w:val="1"/>
+          <w:bCs w:val="1"/>
+          <w:color w:val="366091"/>
+          <w:sz w:val="28"/>
+          <w:szCs w:val="28"/>
+        </w:rPr>
+      </w:pPr>
+      <w:r>
+        <w:rPr>
+          <w:rtl w:val="0"/>
+        </w:rPr>
+      </w:r>
+    </w:p>
+    <w:p>
+      <w:pPr>
+        <w:rPr>
+          <w:rFonts w:ascii="Calibri" w:cs="Calibri" w:eastAsia="Calibri" w:hAnsi="Calibri"/>
+          <w:b w:val="1"/>
+          <w:bCs w:val="1"/>
+          <w:color w:val="366091"/>
+          <w:sz w:val="28"/>
+          <w:szCs w:val="28"/>
+        </w:rPr>
+      </w:pPr>
+      <w:r>
+        <w:rPr>
+          <w:rtl w:val="0"/>
+        </w:rPr>
+      </w:r>
+    </w:p>
+    <w:p>
+      <w:pPr>
+        <w:rPr>
+          <w:rFonts w:ascii="Calibri" w:cs="Calibri" w:eastAsia="Calibri" w:hAnsi="Calibri"/>
+          <w:b w:val="1"/>
+          <w:bCs w:val="1"/>
+          <w:color w:val="366091"/>
+          <w:sz w:val="28"/>
+          <w:szCs w:val="28"/>
+        </w:rPr>
+      </w:pPr>
+      <w:r>
+        <w:rPr>
+          <w:rtl w:val="0"/>
+        </w:rPr>
+      </w:r>
+    </w:p>
+    <w:p>
+      <w:pPr>
+        <w:rPr>
+          <w:rFonts w:ascii="Calibri" w:cs="Calibri" w:eastAsia="Calibri" w:hAnsi="Calibri"/>
+          <w:b w:val="1"/>
+          <w:bCs w:val="1"/>
+          <w:color w:val="366091"/>
+          <w:sz w:val="28"/>
+          <w:szCs w:val="28"/>
+        </w:rPr>
+      </w:pPr>
       <w:r>
         <w:rPr>
           <w:rtl w:val="0"/>
@@ -8384,12 +11291,28 @@
       </w:r>
     </w:p>
     <w:sectPr>
+      <w:headerReference r:id="rId8" w:type="default"/>
       <w:pgSz w:h="15840" w:w="12240" w:orient="portrait"/>
       <w:pgMar w:bottom="1440" w:top="1440" w:left="1440" w:right="1440" w:header="720" w:footer="720"/>
       <w:pgNumType w:start="1"/>
     </w:sectPr>
   </w:body>
 </w:document>
+</file>
+
+<file path=word/header1.xml><?xml version="1.0" encoding="utf-8"?>
+<w:hdr xmlns:mc="http://schemas.openxmlformats.org/markup-compatibility/2006" xmlns:o="urn:schemas-microsoft-com:office:office" xmlns:r="http://schemas.openxmlformats.org/officeDocument/2006/relationships" xmlns:m="http://schemas.openxmlformats.org/officeDocument/2006/math" xmlns:v="urn:schemas-microsoft-com:vml" xmlns:wp="http://schemas.openxmlformats.org/drawingml/2006/wordprocessingDrawing" xmlns:w10="urn:schemas-microsoft-com:office:word" xmlns:w="http://schemas.openxmlformats.org/wordprocessingml/2006/main" xmlns:wne="http://schemas.microsoft.com/office/word/2006/wordml" xmlns:sl="http://schemas.openxmlformats.org/schemaLibrary/2006/main" xmlns:a="http://schemas.openxmlformats.org/drawingml/2006/main" xmlns:pic="http://schemas.openxmlformats.org/drawingml/2006/picture" xmlns:c="http://schemas.openxmlformats.org/drawingml/2006/chart" xmlns:lc="http://schemas.openxmlformats.org/drawingml/2006/lockedCanvas" xmlns:dgm="http://schemas.openxmlformats.org/drawingml/2006/diagram" xmlns:wps="http://schemas.microsoft.com/office/word/2010/wordprocessingShape" xmlns:wpg="http://schemas.microsoft.com/office/word/2010/wordprocessingGroup" xmlns:w14="http://schemas.microsoft.com/office/word/2010/wordml" xmlns:w15="http://schemas.microsoft.com/office/word/2012/wordml" xmlns:w16="http://schemas.microsoft.com/office/word/2018/wordml" xmlns:w16cex="http://schemas.microsoft.com/office/word/2018/wordml/cex" xmlns:w16cid="http://schemas.microsoft.com/office/word/2016/wordml/cid" xmlns="http://schemas.microsoft.com/office/tasks/2019/documenttasks" xmlns:cr="http://schemas.microsoft.com/office/comments/2020/reactions">
+  <w:p>
+    <w:pPr>
+      <w:rPr/>
+    </w:pPr>
+    <w:r>
+      <w:rPr>
+        <w:rtl w:val="0"/>
+      </w:rPr>
+    </w:r>
+  </w:p>
+</w:hdr>
 </file>
 
 <file path=word/numbering.xml><?xml version="1.0" encoding="utf-8"?>
@@ -8401,6 +11324,116 @@
       <w:lvlText w:val="●"/>
       <w:lvlJc w:val="left"/>
       <w:pPr>
+        <w:ind w:left="720" w:hanging="360"/>
+      </w:pPr>
+      <w:rPr>
+        <w:u w:val="none"/>
+      </w:rPr>
+    </w:lvl>
+    <w:lvl w:ilvl="1">
+      <w:start w:val="1"/>
+      <w:numFmt w:val="bullet"/>
+      <w:lvlText w:val="○"/>
+      <w:lvlJc w:val="left"/>
+      <w:pPr>
+        <w:ind w:left="1440" w:hanging="360"/>
+      </w:pPr>
+      <w:rPr>
+        <w:u w:val="none"/>
+      </w:rPr>
+    </w:lvl>
+    <w:lvl w:ilvl="2">
+      <w:start w:val="1"/>
+      <w:numFmt w:val="bullet"/>
+      <w:lvlText w:val="■"/>
+      <w:lvlJc w:val="left"/>
+      <w:pPr>
+        <w:ind w:left="2160" w:hanging="360"/>
+      </w:pPr>
+      <w:rPr>
+        <w:u w:val="none"/>
+      </w:rPr>
+    </w:lvl>
+    <w:lvl w:ilvl="3">
+      <w:start w:val="1"/>
+      <w:numFmt w:val="bullet"/>
+      <w:lvlText w:val="●"/>
+      <w:lvlJc w:val="left"/>
+      <w:pPr>
+        <w:ind w:left="2880" w:hanging="360"/>
+      </w:pPr>
+      <w:rPr>
+        <w:u w:val="none"/>
+      </w:rPr>
+    </w:lvl>
+    <w:lvl w:ilvl="4">
+      <w:start w:val="1"/>
+      <w:numFmt w:val="bullet"/>
+      <w:lvlText w:val="○"/>
+      <w:lvlJc w:val="left"/>
+      <w:pPr>
+        <w:ind w:left="3600" w:hanging="360"/>
+      </w:pPr>
+      <w:rPr>
+        <w:u w:val="none"/>
+      </w:rPr>
+    </w:lvl>
+    <w:lvl w:ilvl="5">
+      <w:start w:val="1"/>
+      <w:numFmt w:val="bullet"/>
+      <w:lvlText w:val="■"/>
+      <w:lvlJc w:val="left"/>
+      <w:pPr>
+        <w:ind w:left="4320" w:hanging="360"/>
+      </w:pPr>
+      <w:rPr>
+        <w:u w:val="none"/>
+      </w:rPr>
+    </w:lvl>
+    <w:lvl w:ilvl="6">
+      <w:start w:val="1"/>
+      <w:numFmt w:val="bullet"/>
+      <w:lvlText w:val="●"/>
+      <w:lvlJc w:val="left"/>
+      <w:pPr>
+        <w:ind w:left="5040" w:hanging="360"/>
+      </w:pPr>
+      <w:rPr>
+        <w:u w:val="none"/>
+      </w:rPr>
+    </w:lvl>
+    <w:lvl w:ilvl="7">
+      <w:start w:val="1"/>
+      <w:numFmt w:val="bullet"/>
+      <w:lvlText w:val="○"/>
+      <w:lvlJc w:val="left"/>
+      <w:pPr>
+        <w:ind w:left="5760" w:hanging="360"/>
+      </w:pPr>
+      <w:rPr>
+        <w:u w:val="none"/>
+      </w:rPr>
+    </w:lvl>
+    <w:lvl w:ilvl="8">
+      <w:start w:val="1"/>
+      <w:numFmt w:val="bullet"/>
+      <w:lvlText w:val="■"/>
+      <w:lvlJc w:val="left"/>
+      <w:pPr>
+        <w:ind w:left="6480" w:hanging="360"/>
+      </w:pPr>
+      <w:rPr>
+        <w:u w:val="none"/>
+      </w:rPr>
+    </w:lvl>
+  </w:abstractNum>
+  <w:abstractNum w:abstractNumId="2">
+    <w:lvl w:ilvl="0">
+      <w:start w:val="1"/>
+      <w:numFmt w:val="bullet"/>
+      <w:lvlText w:val="●"/>
+      <w:lvlJc w:val="left"/>
+      <w:pPr>
         <w:ind w:left="360" w:hanging="360"/>
       </w:pPr>
       <w:rPr>
@@ -8488,7 +11521,7 @@
       <w:rPr/>
     </w:lvl>
   </w:abstractNum>
-  <w:abstractNum w:abstractNumId="2">
+  <w:abstractNum w:abstractNumId="3">
     <w:lvl w:ilvl="0">
       <w:start w:val="1"/>
       <w:numFmt w:val="decimal"/>
@@ -8580,11 +11613,127 @@
       <w:rPr/>
     </w:lvl>
   </w:abstractNum>
+  <w:abstractNum w:abstractNumId="4">
+    <w:lvl w:ilvl="0">
+      <w:start w:val="1"/>
+      <w:numFmt w:val="bullet"/>
+      <w:lvlText w:val="●"/>
+      <w:lvlJc w:val="left"/>
+      <w:pPr>
+        <w:ind w:left="720" w:hanging="360"/>
+      </w:pPr>
+      <w:rPr>
+        <w:u w:val="none"/>
+      </w:rPr>
+    </w:lvl>
+    <w:lvl w:ilvl="1">
+      <w:start w:val="1"/>
+      <w:numFmt w:val="bullet"/>
+      <w:lvlText w:val="○"/>
+      <w:lvlJc w:val="left"/>
+      <w:pPr>
+        <w:ind w:left="1440" w:hanging="360"/>
+      </w:pPr>
+      <w:rPr>
+        <w:u w:val="none"/>
+      </w:rPr>
+    </w:lvl>
+    <w:lvl w:ilvl="2">
+      <w:start w:val="1"/>
+      <w:numFmt w:val="bullet"/>
+      <w:lvlText w:val="■"/>
+      <w:lvlJc w:val="left"/>
+      <w:pPr>
+        <w:ind w:left="2160" w:hanging="360"/>
+      </w:pPr>
+      <w:rPr>
+        <w:u w:val="none"/>
+      </w:rPr>
+    </w:lvl>
+    <w:lvl w:ilvl="3">
+      <w:start w:val="1"/>
+      <w:numFmt w:val="bullet"/>
+      <w:lvlText w:val="●"/>
+      <w:lvlJc w:val="left"/>
+      <w:pPr>
+        <w:ind w:left="2880" w:hanging="360"/>
+      </w:pPr>
+      <w:rPr>
+        <w:u w:val="none"/>
+      </w:rPr>
+    </w:lvl>
+    <w:lvl w:ilvl="4">
+      <w:start w:val="1"/>
+      <w:numFmt w:val="bullet"/>
+      <w:lvlText w:val="○"/>
+      <w:lvlJc w:val="left"/>
+      <w:pPr>
+        <w:ind w:left="3600" w:hanging="360"/>
+      </w:pPr>
+      <w:rPr>
+        <w:u w:val="none"/>
+      </w:rPr>
+    </w:lvl>
+    <w:lvl w:ilvl="5">
+      <w:start w:val="1"/>
+      <w:numFmt w:val="bullet"/>
+      <w:lvlText w:val="■"/>
+      <w:lvlJc w:val="left"/>
+      <w:pPr>
+        <w:ind w:left="4320" w:hanging="360"/>
+      </w:pPr>
+      <w:rPr>
+        <w:u w:val="none"/>
+      </w:rPr>
+    </w:lvl>
+    <w:lvl w:ilvl="6">
+      <w:start w:val="1"/>
+      <w:numFmt w:val="bullet"/>
+      <w:lvlText w:val="●"/>
+      <w:lvlJc w:val="left"/>
+      <w:pPr>
+        <w:ind w:left="5040" w:hanging="360"/>
+      </w:pPr>
+      <w:rPr>
+        <w:u w:val="none"/>
+      </w:rPr>
+    </w:lvl>
+    <w:lvl w:ilvl="7">
+      <w:start w:val="1"/>
+      <w:numFmt w:val="bullet"/>
+      <w:lvlText w:val="○"/>
+      <w:lvlJc w:val="left"/>
+      <w:pPr>
+        <w:ind w:left="5760" w:hanging="360"/>
+      </w:pPr>
+      <w:rPr>
+        <w:u w:val="none"/>
+      </w:rPr>
+    </w:lvl>
+    <w:lvl w:ilvl="8">
+      <w:start w:val="1"/>
+      <w:numFmt w:val="bullet"/>
+      <w:lvlText w:val="■"/>
+      <w:lvlJc w:val="left"/>
+      <w:pPr>
+        <w:ind w:left="6480" w:hanging="360"/>
+      </w:pPr>
+      <w:rPr>
+        <w:u w:val="none"/>
+      </w:rPr>
+    </w:lvl>
+  </w:abstractNum>
   <w:num w:numId="1">
     <w:abstractNumId w:val="1"/>
   </w:num>
   <w:num w:numId="2">
     <w:abstractNumId w:val="2"/>
+  </w:num>
+  <w:num w:numId="3">
+    <w:abstractNumId w:val="3"/>
+  </w:num>
+  <w:num w:numId="4">
+    <w:abstractNumId w:val="4"/>
   </w:num>
 </w:numbering>
 </file>
@@ -8894,6 +12043,153 @@
         <w:right w:w="108.0" w:type="dxa"/>
       </w:tblCellMar>
     </w:tblPr>
+  </w:style>
+  <w:style w:type="table" w:styleId="Table10">
+    <w:basedOn w:val="TableNormal"/>
+    <w:tblPr>
+      <w:tblStyleRowBandSize w:val="1"/>
+      <w:tblStyleColBandSize w:val="1"/>
+      <w:tblCellMar>
+        <w:top w:w="0.0" w:type="dxa"/>
+        <w:left w:w="115.0" w:type="dxa"/>
+        <w:bottom w:w="0.0" w:type="dxa"/>
+        <w:right w:w="115.0" w:type="dxa"/>
+      </w:tblCellMar>
+    </w:tblPr>
+    <w:tblStylePr w:type="band1Horz">
+      <w:tcPr/>
+    </w:tblStylePr>
+    <w:tblStylePr w:type="band1Vert">
+      <w:tcPr/>
+    </w:tblStylePr>
+    <w:tblStylePr w:type="band2Horz">
+      <w:tcPr/>
+    </w:tblStylePr>
+    <w:tblStylePr w:type="band2Vert">
+      <w:tcPr/>
+    </w:tblStylePr>
+    <w:tblStylePr w:type="firstCol">
+      <w:tcPr/>
+    </w:tblStylePr>
+    <w:tblStylePr w:type="firstRow">
+      <w:tcPr/>
+    </w:tblStylePr>
+    <w:tblStylePr w:type="lastCol">
+      <w:tcPr/>
+    </w:tblStylePr>
+    <w:tblStylePr w:type="lastRow">
+      <w:tcPr/>
+    </w:tblStylePr>
+    <w:tblStylePr w:type="neCell">
+      <w:tcPr/>
+    </w:tblStylePr>
+    <w:tblStylePr w:type="nwCell">
+      <w:tcPr/>
+    </w:tblStylePr>
+    <w:tblStylePr w:type="seCell">
+      <w:tcPr/>
+    </w:tblStylePr>
+    <w:tblStylePr w:type="swCell">
+      <w:tcPr/>
+    </w:tblStylePr>
+  </w:style>
+  <w:style w:type="table" w:styleId="Table11">
+    <w:basedOn w:val="TableNormal"/>
+    <w:tblPr>
+      <w:tblStyleRowBandSize w:val="1"/>
+      <w:tblStyleColBandSize w:val="1"/>
+      <w:tblCellMar>
+        <w:top w:w="0.0" w:type="dxa"/>
+        <w:left w:w="115.0" w:type="dxa"/>
+        <w:bottom w:w="0.0" w:type="dxa"/>
+        <w:right w:w="115.0" w:type="dxa"/>
+      </w:tblCellMar>
+    </w:tblPr>
+    <w:tblStylePr w:type="band1Horz">
+      <w:tcPr/>
+    </w:tblStylePr>
+    <w:tblStylePr w:type="band1Vert">
+      <w:tcPr/>
+    </w:tblStylePr>
+    <w:tblStylePr w:type="band2Horz">
+      <w:tcPr/>
+    </w:tblStylePr>
+    <w:tblStylePr w:type="band2Vert">
+      <w:tcPr/>
+    </w:tblStylePr>
+    <w:tblStylePr w:type="firstCol">
+      <w:tcPr/>
+    </w:tblStylePr>
+    <w:tblStylePr w:type="firstRow">
+      <w:tcPr/>
+    </w:tblStylePr>
+    <w:tblStylePr w:type="lastCol">
+      <w:tcPr/>
+    </w:tblStylePr>
+    <w:tblStylePr w:type="lastRow">
+      <w:tcPr/>
+    </w:tblStylePr>
+    <w:tblStylePr w:type="neCell">
+      <w:tcPr/>
+    </w:tblStylePr>
+    <w:tblStylePr w:type="nwCell">
+      <w:tcPr/>
+    </w:tblStylePr>
+    <w:tblStylePr w:type="seCell">
+      <w:tcPr/>
+    </w:tblStylePr>
+    <w:tblStylePr w:type="swCell">
+      <w:tcPr/>
+    </w:tblStylePr>
+  </w:style>
+  <w:style w:type="table" w:styleId="Table12">
+    <w:basedOn w:val="TableNormal"/>
+    <w:tblPr>
+      <w:tblStyleRowBandSize w:val="1"/>
+      <w:tblStyleColBandSize w:val="1"/>
+      <w:tblCellMar>
+        <w:top w:w="0.0" w:type="dxa"/>
+        <w:left w:w="115.0" w:type="dxa"/>
+        <w:bottom w:w="0.0" w:type="dxa"/>
+        <w:right w:w="115.0" w:type="dxa"/>
+      </w:tblCellMar>
+    </w:tblPr>
+    <w:tblStylePr w:type="band1Horz">
+      <w:tcPr/>
+    </w:tblStylePr>
+    <w:tblStylePr w:type="band1Vert">
+      <w:tcPr/>
+    </w:tblStylePr>
+    <w:tblStylePr w:type="band2Horz">
+      <w:tcPr/>
+    </w:tblStylePr>
+    <w:tblStylePr w:type="band2Vert">
+      <w:tcPr/>
+    </w:tblStylePr>
+    <w:tblStylePr w:type="firstCol">
+      <w:tcPr/>
+    </w:tblStylePr>
+    <w:tblStylePr w:type="firstRow">
+      <w:tcPr/>
+    </w:tblStylePr>
+    <w:tblStylePr w:type="lastCol">
+      <w:tcPr/>
+    </w:tblStylePr>
+    <w:tblStylePr w:type="lastRow">
+      <w:tcPr/>
+    </w:tblStylePr>
+    <w:tblStylePr w:type="neCell">
+      <w:tcPr/>
+    </w:tblStylePr>
+    <w:tblStylePr w:type="nwCell">
+      <w:tcPr/>
+    </w:tblStylePr>
+    <w:tblStylePr w:type="seCell">
+      <w:tcPr/>
+    </w:tblStylePr>
+    <w:tblStylePr w:type="swCell">
+      <w:tcPr/>
+    </w:tblStylePr>
   </w:style>
 </w:styles>
 </file>

</xml_diff>

<commit_message>
removed redundant internal holdout and updated the docs
</commit_message>
<xml_diff>
--- a/docs/NetGuard-AI-Written-Report.docx
+++ b/docs/NetGuard-AI-Written-Report.docx
@@ -5970,20 +5970,6 @@
         <w:rPr>
           <w:rtl w:val="0"/>
         </w:rPr>
-      </w:r>
-    </w:p>
-    <w:p>
-      <w:pPr>
-        <w:rPr>
-          <w:rFonts w:ascii="Calibri" w:cs="Calibri" w:eastAsia="Calibri" w:hAnsi="Calibri"/>
-        </w:rPr>
-      </w:pPr>
-      <w:r>
-        <w:rPr>
-          <w:rFonts w:ascii="Calibri" w:cs="Calibri" w:eastAsia="Calibri" w:hAnsi="Calibri"/>
-          <w:rtl w:val="0"/>
-        </w:rPr>
-        <w:t xml:space="preserve">A supplementary 20% stratified holdout from the same training file scored approximately 99.9% accuracy. That figure is optimistic because train and test rows share the same file and simplified normal/anomaly labels; it is reported only as a sanity check, not as the primary benchmark.</w:t>
       </w:r>
     </w:p>
     <w:p>

</xml_diff>